<commit_message>
Update template styles for headings to reduce whitespace
</commit_message>
<xml_diff>
--- a/manual-template.docx
+++ b/manual-template.docx
@@ -13,17 +13,12 @@
     <w:p>
       <w:pPr>
         <w:pStyle w:val="Heading2"/>
-        <w:rPr>
-          <w:sz w:val="36"/>
-          <w:szCs w:val="36"/>
-        </w:rPr>
       </w:pPr>
       <w:r>
-        <w:rPr>
-          <w:sz w:val="36"/>
-          <w:szCs w:val="36"/>
-        </w:rPr>
-        <w:t>Heading 2</w:t>
+        <w:t>Heading</w:t>
+      </w:r>
+      <w:r>
+        <w:t xml:space="preserve"> 2</w:t>
       </w:r>
     </w:p>
     <w:p>
@@ -508,11 +503,11 @@
     <w:uiPriority w:val="9"/>
     <w:unhideWhenUsed/>
     <w:qFormat/>
-    <w:rsid w:val="00902FF0"/>
+    <w:rsid w:val="00F14C3E"/>
     <w:pPr>
       <w:keepNext/>
       <w:keepLines/>
-      <w:spacing w:before="200" w:after="0"/>
+      <w:spacing w:before="240" w:after="120"/>
       <w:outlineLvl w:val="1"/>
     </w:pPr>
     <w:rPr>
@@ -520,13 +515,14 @@
       <w:b/>
       <w:bCs/>
       <w:color w:val="4F81BD" w:themeColor="accent1"/>
-      <w:sz w:val="26"/>
-      <w:szCs w:val="26"/>
+      <w:sz w:val="36"/>
+      <w:szCs w:val="36"/>
     </w:rPr>
   </w:style>
   <w:style w:type="character" w:default="1" w:styleId="DefaultParagraphFont">
     <w:name w:val="Default Paragraph Font"/>
     <w:uiPriority w:val="1"/>
+    <w:semiHidden/>
     <w:unhideWhenUsed/>
   </w:style>
   <w:style w:type="table" w:default="1" w:styleId="TableNormal">
@@ -691,14 +687,14 @@
     <w:basedOn w:val="DefaultParagraphFont"/>
     <w:link w:val="Heading2"/>
     <w:uiPriority w:val="9"/>
-    <w:rsid w:val="00902FF0"/>
+    <w:rsid w:val="00F14C3E"/>
     <w:rPr>
       <w:rFonts w:eastAsiaTheme="majorEastAsia" w:cstheme="minorHAnsi"/>
       <w:b/>
       <w:bCs/>
       <w:color w:val="4F81BD" w:themeColor="accent1"/>
-      <w:sz w:val="26"/>
-      <w:szCs w:val="26"/>
+      <w:sz w:val="36"/>
+      <w:szCs w:val="36"/>
     </w:rPr>
   </w:style>
   <w:style w:type="paragraph" w:styleId="ListParagraph">
@@ -909,11 +905,11 @@
     <w:uiPriority w:val="9"/>
     <w:unhideWhenUsed/>
     <w:qFormat/>
-    <w:rsid w:val="00902FF0"/>
+    <w:rsid w:val="00F14C3E"/>
     <w:pPr>
       <w:keepNext/>
       <w:keepLines/>
-      <w:spacing w:before="200" w:after="0"/>
+      <w:spacing w:before="240" w:after="120"/>
       <w:outlineLvl w:val="1"/>
     </w:pPr>
     <w:rPr>
@@ -921,13 +917,14 @@
       <w:b/>
       <w:bCs/>
       <w:color w:val="4F81BD" w:themeColor="accent1"/>
-      <w:sz w:val="26"/>
-      <w:szCs w:val="26"/>
+      <w:sz w:val="36"/>
+      <w:szCs w:val="36"/>
     </w:rPr>
   </w:style>
   <w:style w:type="character" w:default="1" w:styleId="DefaultParagraphFont">
     <w:name w:val="Default Paragraph Font"/>
     <w:uiPriority w:val="1"/>
+    <w:semiHidden/>
     <w:unhideWhenUsed/>
   </w:style>
   <w:style w:type="table" w:default="1" w:styleId="TableNormal">
@@ -1092,14 +1089,14 @@
     <w:basedOn w:val="DefaultParagraphFont"/>
     <w:link w:val="Heading2"/>
     <w:uiPriority w:val="9"/>
-    <w:rsid w:val="00902FF0"/>
+    <w:rsid w:val="00F14C3E"/>
     <w:rPr>
       <w:rFonts w:eastAsiaTheme="majorEastAsia" w:cstheme="minorHAnsi"/>
       <w:b/>
       <w:bCs/>
       <w:color w:val="4F81BD" w:themeColor="accent1"/>
-      <w:sz w:val="26"/>
-      <w:szCs w:val="26"/>
+      <w:sz w:val="36"/>
+      <w:szCs w:val="36"/>
     </w:rPr>
   </w:style>
   <w:style w:type="paragraph" w:styleId="ListParagraph">
@@ -1406,7 +1403,7 @@
 </file>
 
 <file path=customXml/itemProps1.xml><?xml version="1.0" encoding="utf-8"?>
-<ds:datastoreItem xmlns:ds="http://schemas.openxmlformats.org/officeDocument/2006/customXml" ds:itemID="{A2D951EF-8609-433B-806A-D8ADBA723AB7}">
+<ds:datastoreItem xmlns:ds="http://schemas.openxmlformats.org/officeDocument/2006/customXml" ds:itemID="{DFF19BD3-99EE-4210-BE99-5302C083920B}">
   <ds:schemaRefs>
     <ds:schemaRef ds:uri="http://schemas.openxmlformats.org/officeDocument/2006/bibliography"/>
   </ds:schemaRefs>

</xml_diff>

<commit_message>
Conversion of original tilt up manual to markdown format, and update all images to a5 isometric
</commit_message>
<xml_diff>
--- a/manual-template.docx
+++ b/manual-template.docx
@@ -22,6 +22,37 @@
       </w:r>
     </w:p>
     <w:p>
+      <w:pPr>
+        <w:pStyle w:val="Heading3"/>
+        <w:spacing w:before="240" w:after="120"/>
+        <w:rPr>
+          <w:sz w:val="24"/>
+        </w:rPr>
+      </w:pPr>
+      <w:r>
+        <w:rPr>
+          <w:sz w:val="24"/>
+        </w:rPr>
+        <w:t>Heading 3</w:t>
+      </w:r>
+    </w:p>
+    <w:p>
+      <w:pPr>
+        <w:pStyle w:val="Heading4"/>
+      </w:pPr>
+      <w:r>
+        <w:t>Heading</w:t>
+      </w:r>
+      <w:r>
+        <w:t xml:space="preserve"> </w:t>
+      </w:r>
+      <w:r>
+        <w:t>4</w:t>
+      </w:r>
+      <w:bookmarkStart w:id="0" w:name="_GoBack"/>
+      <w:bookmarkEnd w:id="0"/>
+    </w:p>
+    <w:p>
       <w:r>
         <w:t>Normal text</w:t>
       </w:r>
@@ -42,6 +73,18 @@
       <w:pPr>
         <w:pStyle w:val="ListParagraph"/>
         <w:numPr>
+          <w:ilvl w:val="0"/>
+          <w:numId w:val="1"/>
+        </w:numPr>
+      </w:pPr>
+      <w:r>
+        <w:t>Another bullet point</w:t>
+      </w:r>
+    </w:p>
+    <w:p>
+      <w:pPr>
+        <w:pStyle w:val="ListParagraph"/>
+        <w:numPr>
           <w:ilvl w:val="1"/>
           <w:numId w:val="1"/>
         </w:numPr>
@@ -62,10 +105,7 @@
         <w:t xml:space="preserve">Sub-sub bullet </w:t>
       </w:r>
     </w:p>
-    <w:p>
-      <w:bookmarkStart w:id="0" w:name="_GoBack"/>
-      <w:bookmarkEnd w:id="0"/>
-    </w:p>
+    <w:p/>
     <w:sectPr>
       <w:footerReference w:type="default" r:id="rId9"/>
       <w:pgSz w:w="12240" w:h="15840" w:code="1"/>
@@ -519,6 +559,52 @@
       <w:szCs w:val="36"/>
     </w:rPr>
   </w:style>
+  <w:style w:type="paragraph" w:styleId="Heading3">
+    <w:name w:val="heading 3"/>
+    <w:basedOn w:val="Normal"/>
+    <w:next w:val="Normal"/>
+    <w:link w:val="Heading3Char"/>
+    <w:uiPriority w:val="9"/>
+    <w:unhideWhenUsed/>
+    <w:qFormat/>
+    <w:rsid w:val="00B8774B"/>
+    <w:pPr>
+      <w:keepNext/>
+      <w:keepLines/>
+      <w:spacing w:before="200" w:after="0"/>
+      <w:outlineLvl w:val="2"/>
+    </w:pPr>
+    <w:rPr>
+      <w:rFonts w:eastAsiaTheme="majorEastAsia" w:cstheme="minorHAnsi"/>
+      <w:b/>
+      <w:bCs/>
+      <w:color w:val="4F81BD" w:themeColor="accent1"/>
+      <w:sz w:val="28"/>
+      <w:szCs w:val="28"/>
+    </w:rPr>
+  </w:style>
+  <w:style w:type="paragraph" w:styleId="Heading4">
+    <w:name w:val="heading 4"/>
+    <w:basedOn w:val="Normal"/>
+    <w:next w:val="Normal"/>
+    <w:link w:val="Heading4Char"/>
+    <w:uiPriority w:val="9"/>
+    <w:unhideWhenUsed/>
+    <w:qFormat/>
+    <w:rsid w:val="00DF130E"/>
+    <w:pPr>
+      <w:keepNext/>
+      <w:keepLines/>
+      <w:spacing w:before="240" w:after="120"/>
+      <w:outlineLvl w:val="3"/>
+    </w:pPr>
+    <w:rPr>
+      <w:rFonts w:eastAsiaTheme="majorEastAsia" w:cstheme="minorHAnsi"/>
+      <w:b/>
+      <w:bCs/>
+      <w:iCs/>
+    </w:rPr>
+  </w:style>
   <w:style w:type="character" w:default="1" w:styleId="DefaultParagraphFont">
     <w:name w:val="Default Paragraph Font"/>
     <w:uiPriority w:val="1"/>
@@ -707,6 +793,34 @@
       <w:ind w:left="720"/>
       <w:contextualSpacing/>
     </w:pPr>
+  </w:style>
+  <w:style w:type="character" w:customStyle="1" w:styleId="Heading3Char">
+    <w:name w:val="Heading 3 Char"/>
+    <w:basedOn w:val="DefaultParagraphFont"/>
+    <w:link w:val="Heading3"/>
+    <w:uiPriority w:val="9"/>
+    <w:rsid w:val="00B8774B"/>
+    <w:rPr>
+      <w:rFonts w:eastAsiaTheme="majorEastAsia" w:cstheme="minorHAnsi"/>
+      <w:b/>
+      <w:bCs/>
+      <w:color w:val="4F81BD" w:themeColor="accent1"/>
+      <w:sz w:val="28"/>
+      <w:szCs w:val="28"/>
+    </w:rPr>
+  </w:style>
+  <w:style w:type="character" w:customStyle="1" w:styleId="Heading4Char">
+    <w:name w:val="Heading 4 Char"/>
+    <w:basedOn w:val="DefaultParagraphFont"/>
+    <w:link w:val="Heading4"/>
+    <w:uiPriority w:val="9"/>
+    <w:rsid w:val="00DF130E"/>
+    <w:rPr>
+      <w:rFonts w:eastAsiaTheme="majorEastAsia" w:cstheme="minorHAnsi"/>
+      <w:b/>
+      <w:bCs/>
+      <w:iCs/>
+    </w:rPr>
   </w:style>
 </w:styles>
 </file>
@@ -921,6 +1035,52 @@
       <w:szCs w:val="36"/>
     </w:rPr>
   </w:style>
+  <w:style w:type="paragraph" w:styleId="Heading3">
+    <w:name w:val="heading 3"/>
+    <w:basedOn w:val="Normal"/>
+    <w:next w:val="Normal"/>
+    <w:link w:val="Heading3Char"/>
+    <w:uiPriority w:val="9"/>
+    <w:unhideWhenUsed/>
+    <w:qFormat/>
+    <w:rsid w:val="00B8774B"/>
+    <w:pPr>
+      <w:keepNext/>
+      <w:keepLines/>
+      <w:spacing w:before="200" w:after="0"/>
+      <w:outlineLvl w:val="2"/>
+    </w:pPr>
+    <w:rPr>
+      <w:rFonts w:eastAsiaTheme="majorEastAsia" w:cstheme="minorHAnsi"/>
+      <w:b/>
+      <w:bCs/>
+      <w:color w:val="4F81BD" w:themeColor="accent1"/>
+      <w:sz w:val="28"/>
+      <w:szCs w:val="28"/>
+    </w:rPr>
+  </w:style>
+  <w:style w:type="paragraph" w:styleId="Heading4">
+    <w:name w:val="heading 4"/>
+    <w:basedOn w:val="Normal"/>
+    <w:next w:val="Normal"/>
+    <w:link w:val="Heading4Char"/>
+    <w:uiPriority w:val="9"/>
+    <w:unhideWhenUsed/>
+    <w:qFormat/>
+    <w:rsid w:val="00DF130E"/>
+    <w:pPr>
+      <w:keepNext/>
+      <w:keepLines/>
+      <w:spacing w:before="240" w:after="120"/>
+      <w:outlineLvl w:val="3"/>
+    </w:pPr>
+    <w:rPr>
+      <w:rFonts w:eastAsiaTheme="majorEastAsia" w:cstheme="minorHAnsi"/>
+      <w:b/>
+      <w:bCs/>
+      <w:iCs/>
+    </w:rPr>
+  </w:style>
   <w:style w:type="character" w:default="1" w:styleId="DefaultParagraphFont">
     <w:name w:val="Default Paragraph Font"/>
     <w:uiPriority w:val="1"/>
@@ -1109,6 +1269,34 @@
       <w:ind w:left="720"/>
       <w:contextualSpacing/>
     </w:pPr>
+  </w:style>
+  <w:style w:type="character" w:customStyle="1" w:styleId="Heading3Char">
+    <w:name w:val="Heading 3 Char"/>
+    <w:basedOn w:val="DefaultParagraphFont"/>
+    <w:link w:val="Heading3"/>
+    <w:uiPriority w:val="9"/>
+    <w:rsid w:val="00B8774B"/>
+    <w:rPr>
+      <w:rFonts w:eastAsiaTheme="majorEastAsia" w:cstheme="minorHAnsi"/>
+      <w:b/>
+      <w:bCs/>
+      <w:color w:val="4F81BD" w:themeColor="accent1"/>
+      <w:sz w:val="28"/>
+      <w:szCs w:val="28"/>
+    </w:rPr>
+  </w:style>
+  <w:style w:type="character" w:customStyle="1" w:styleId="Heading4Char">
+    <w:name w:val="Heading 4 Char"/>
+    <w:basedOn w:val="DefaultParagraphFont"/>
+    <w:link w:val="Heading4"/>
+    <w:uiPriority w:val="9"/>
+    <w:rsid w:val="00DF130E"/>
+    <w:rPr>
+      <w:rFonts w:eastAsiaTheme="majorEastAsia" w:cstheme="minorHAnsi"/>
+      <w:b/>
+      <w:bCs/>
+      <w:iCs/>
+    </w:rPr>
   </w:style>
 </w:styles>
 </file>
@@ -1403,7 +1591,7 @@
 </file>
 
 <file path=customXml/itemProps1.xml><?xml version="1.0" encoding="utf-8"?>
-<ds:datastoreItem xmlns:ds="http://schemas.openxmlformats.org/officeDocument/2006/customXml" ds:itemID="{DFF19BD3-99EE-4210-BE99-5302C083920B}">
+<ds:datastoreItem xmlns:ds="http://schemas.openxmlformats.org/officeDocument/2006/customXml" ds:itemID="{74202ACB-5DD1-43B7-B8CC-343004FA02AE}">
   <ds:schemaRefs>
     <ds:schemaRef ds:uri="http://schemas.openxmlformats.org/officeDocument/2006/bibliography"/>
   </ds:schemaRefs>

</xml_diff>

<commit_message>
Update manual template after merge of master -> main branches. Increase font size, update spacing on list styles
</commit_message>
<xml_diff>
--- a/manual-template.docx
+++ b/manual-template.docx
@@ -24,21 +24,31 @@
     <w:p>
       <w:pPr>
         <w:pStyle w:val="Heading3"/>
-        <w:spacing w:before="240" w:after="120"/>
-        <w:rPr>
-          <w:sz w:val="24"/>
-        </w:rPr>
       </w:pPr>
       <w:r>
-        <w:rPr>
-          <w:sz w:val="24"/>
-        </w:rPr>
-        <w:t>Heading 3</w:t>
+        <w:t>Heading</w:t>
+      </w:r>
+      <w:r>
+        <w:t xml:space="preserve"> 3</w:t>
+      </w:r>
+      <w:r>
+        <w:t xml:space="preserve"> </w:t>
+      </w:r>
+      <w:proofErr w:type="gramStart"/>
+      <w:r>
+        <w:t>( large</w:t>
+      </w:r>
+      <w:proofErr w:type="gramEnd"/>
+      <w:r>
+        <w:t xml:space="preserve"> text )</w:t>
       </w:r>
     </w:p>
     <w:p>
       <w:pPr>
         <w:pStyle w:val="Heading4"/>
+        <w:rPr>
+          <w:b/>
+        </w:rPr>
       </w:pPr>
       <w:r>
         <w:t>Heading</w:t>
@@ -49,69 +59,20 @@
       <w:r>
         <w:t>4</w:t>
       </w:r>
-      <w:bookmarkStart w:id="0" w:name="_GoBack"/>
-      <w:bookmarkEnd w:id="0"/>
     </w:p>
     <w:p>
       <w:r>
         <w:t>Normal text</w:t>
       </w:r>
+      <w:bookmarkStart w:id="0" w:name="_GoBack"/>
+      <w:bookmarkEnd w:id="0"/>
     </w:p>
-    <w:p>
-      <w:pPr>
-        <w:pStyle w:val="ListParagraph"/>
-        <w:numPr>
-          <w:ilvl w:val="0"/>
-          <w:numId w:val="1"/>
-        </w:numPr>
-      </w:pPr>
-      <w:r>
-        <w:t>Bullet point</w:t>
-      </w:r>
-    </w:p>
-    <w:p>
-      <w:pPr>
-        <w:pStyle w:val="ListParagraph"/>
-        <w:numPr>
-          <w:ilvl w:val="0"/>
-          <w:numId w:val="1"/>
-        </w:numPr>
-      </w:pPr>
-      <w:r>
-        <w:t>Another bullet point</w:t>
-      </w:r>
-    </w:p>
-    <w:p>
-      <w:pPr>
-        <w:pStyle w:val="ListParagraph"/>
-        <w:numPr>
-          <w:ilvl w:val="1"/>
-          <w:numId w:val="1"/>
-        </w:numPr>
-      </w:pPr>
-      <w:r>
-        <w:t>Sub-bullet</w:t>
-      </w:r>
-    </w:p>
-    <w:p>
-      <w:pPr>
-        <w:pStyle w:val="ListParagraph"/>
-        <w:numPr>
-          <w:ilvl w:val="2"/>
-          <w:numId w:val="1"/>
-        </w:numPr>
-      </w:pPr>
-      <w:r>
-        <w:t xml:space="preserve">Sub-sub bullet </w:t>
-      </w:r>
-    </w:p>
-    <w:p/>
     <w:sectPr>
       <w:footerReference w:type="default" r:id="rId9"/>
       <w:pgSz w:w="12240" w:h="15840" w:code="1"/>
       <w:pgMar w:top="1440" w:right="1440" w:bottom="1440" w:left="1440" w:header="708" w:footer="708" w:gutter="0"/>
       <w:cols w:space="708"/>
-      <w:docGrid w:linePitch="360"/>
+      <w:docGrid w:linePitch="381"/>
     </w:sectPr>
   </w:body>
 </w:document>
@@ -121,9 +82,6 @@
 <w:endnotes xmlns:wpc="http://schemas.microsoft.com/office/word/2010/wordprocessingCanvas" xmlns:mc="http://schemas.openxmlformats.org/markup-compatibility/2006" xmlns:o="urn:schemas-microsoft-com:office:office" xmlns:r="http://schemas.openxmlformats.org/officeDocument/2006/relationships" xmlns:m="http://schemas.openxmlformats.org/officeDocument/2006/math" xmlns:v="urn:schemas-microsoft-com:vml" xmlns:wp14="http://schemas.microsoft.com/office/word/2010/wordprocessingDrawing" xmlns:wp="http://schemas.openxmlformats.org/drawingml/2006/wordprocessingDrawing" xmlns:w10="urn:schemas-microsoft-com:office:word" xmlns:w="http://schemas.openxmlformats.org/wordprocessingml/2006/main" xmlns:w14="http://schemas.microsoft.com/office/word/2010/wordml" xmlns:wpg="http://schemas.microsoft.com/office/word/2010/wordprocessingGroup" xmlns:wpi="http://schemas.microsoft.com/office/word/2010/wordprocessingInk" xmlns:wne="http://schemas.microsoft.com/office/word/2006/wordml" xmlns:wps="http://schemas.microsoft.com/office/word/2010/wordprocessingShape" mc:Ignorable="w14 wp14">
   <w:endnote w:type="separator" w:id="-1">
     <w:p>
-      <w:pPr>
-        <w:spacing w:after="0" w:line="240" w:lineRule="auto"/>
-      </w:pPr>
       <w:r>
         <w:separator/>
       </w:r>
@@ -131,13 +89,13 @@
   </w:endnote>
   <w:endnote w:type="continuationSeparator" w:id="0">
     <w:p>
-      <w:pPr>
-        <w:spacing w:after="0" w:line="240" w:lineRule="auto"/>
-      </w:pPr>
       <w:r>
         <w:continuationSeparator/>
       </w:r>
     </w:p>
+  </w:endnote>
+  <w:endnote w:type="continuationNotice" w:id="1">
+    <w:p/>
   </w:endnote>
 </w:endnotes>
 </file>
@@ -148,7 +106,7 @@
     <w:pPr>
       <w:pStyle w:val="Footer"/>
       <w:pBdr>
-        <w:top w:val="single" w:sz="4" w:space="1" w:color="BFBFBF" w:themeColor="background1" w:themeShade="BF"/>
+        <w:top w:val="single" w:sz="4" w:space="1" w:color="auto"/>
       </w:pBdr>
     </w:pPr>
     <w:r>
@@ -158,10 +116,13 @@
       <w:ptab w:relativeTo="margin" w:alignment="center" w:leader="none"/>
     </w:r>
     <w:r>
+      <w:t xml:space="preserve"> </w:t>
+    </w:r>
+    <w:r>
       <w:fldChar w:fldCharType="begin"/>
     </w:r>
     <w:r>
-      <w:instrText xml:space="preserve"> PRINTDATE  \@ "d MMMM yyyy"  \* MERGEFORMAT </w:instrText>
+      <w:instrText xml:space="preserve"> SAVEDATE  \@ "d MMMM yyyy"  \* MERGEFORMAT </w:instrText>
     </w:r>
     <w:r>
       <w:fldChar w:fldCharType="separate"/>
@@ -170,10 +131,13 @@
       <w:rPr>
         <w:noProof/>
       </w:rPr>
-      <w:t>0 XXX 0000</w:t>
+      <w:t>12 March 2025</w:t>
     </w:r>
     <w:r>
       <w:fldChar w:fldCharType="end"/>
+    </w:r>
+    <w:r>
+      <w:t xml:space="preserve"> </w:t>
     </w:r>
     <w:r>
       <w:ptab w:relativeTo="margin" w:alignment="right" w:leader="none"/>
@@ -194,9 +158,6 @@
       <w:t>1</w:t>
     </w:r>
     <w:r>
-      <w:rPr>
-        <w:noProof/>
-      </w:rPr>
       <w:fldChar w:fldCharType="end"/>
     </w:r>
   </w:p>
@@ -207,9 +168,6 @@
 <w:footnotes xmlns:wpc="http://schemas.microsoft.com/office/word/2010/wordprocessingCanvas" xmlns:mc="http://schemas.openxmlformats.org/markup-compatibility/2006" xmlns:o="urn:schemas-microsoft-com:office:office" xmlns:r="http://schemas.openxmlformats.org/officeDocument/2006/relationships" xmlns:m="http://schemas.openxmlformats.org/officeDocument/2006/math" xmlns:v="urn:schemas-microsoft-com:vml" xmlns:wp14="http://schemas.microsoft.com/office/word/2010/wordprocessingDrawing" xmlns:wp="http://schemas.openxmlformats.org/drawingml/2006/wordprocessingDrawing" xmlns:w10="urn:schemas-microsoft-com:office:word" xmlns:w="http://schemas.openxmlformats.org/wordprocessingml/2006/main" xmlns:w14="http://schemas.microsoft.com/office/word/2010/wordml" xmlns:wpg="http://schemas.microsoft.com/office/word/2010/wordprocessingGroup" xmlns:wpi="http://schemas.microsoft.com/office/word/2010/wordprocessingInk" xmlns:wne="http://schemas.microsoft.com/office/word/2006/wordml" xmlns:wps="http://schemas.microsoft.com/office/word/2010/wordprocessingShape" mc:Ignorable="w14 wp14">
   <w:footnote w:type="separator" w:id="-1">
     <w:p>
-      <w:pPr>
-        <w:spacing w:after="0" w:line="240" w:lineRule="auto"/>
-      </w:pPr>
       <w:r>
         <w:separator/>
       </w:r>
@@ -217,13 +175,13 @@
   </w:footnote>
   <w:footnote w:type="continuationSeparator" w:id="0">
     <w:p>
-      <w:pPr>
-        <w:spacing w:after="0" w:line="240" w:lineRule="auto"/>
-      </w:pPr>
       <w:r>
         <w:continuationSeparator/>
       </w:r>
     </w:p>
+  </w:footnote>
+  <w:footnote w:type="continuationNotice" w:id="1">
+    <w:p/>
   </w:footnote>
 </w:footnotes>
 </file>
@@ -233,10 +191,11 @@
   <w:abstractNum w:abstractNumId="0">
     <w:nsid w:val="5BCE4232"/>
     <w:multiLevelType w:val="hybridMultilevel"/>
-    <w:tmpl w:val="622EFD06"/>
-    <w:lvl w:ilvl="0" w:tplc="0C090001">
+    <w:tmpl w:val="C14AE192"/>
+    <w:lvl w:ilvl="0" w:tplc="4A0AC008">
       <w:start w:val="1"/>
       <w:numFmt w:val="bullet"/>
+      <w:pStyle w:val="ListParagraph"/>
       <w:lvlText w:val=""/>
       <w:lvlJc w:val="left"/>
       <w:pPr>
@@ -508,6 +467,10 @@
   <w:style w:type="paragraph" w:default="1" w:styleId="Normal">
     <w:name w:val="Normal"/>
     <w:qFormat/>
+    <w:rsid w:val="00682500"/>
+    <w:rPr>
+      <w:sz w:val="28"/>
+    </w:rPr>
   </w:style>
   <w:style w:type="paragraph" w:styleId="Heading1">
     <w:name w:val="heading 1"/>
@@ -543,7 +506,7 @@
     <w:uiPriority w:val="9"/>
     <w:unhideWhenUsed/>
     <w:qFormat/>
-    <w:rsid w:val="00F14C3E"/>
+    <w:rsid w:val="00B467BA"/>
     <w:pPr>
       <w:keepNext/>
       <w:keepLines/>
@@ -567,20 +530,18 @@
     <w:uiPriority w:val="9"/>
     <w:unhideWhenUsed/>
     <w:qFormat/>
-    <w:rsid w:val="00B8774B"/>
+    <w:rsid w:val="001716AF"/>
     <w:pPr>
       <w:keepNext/>
       <w:keepLines/>
-      <w:spacing w:before="200" w:after="0"/>
+      <w:spacing w:before="120" w:after="0"/>
       <w:outlineLvl w:val="2"/>
     </w:pPr>
     <w:rPr>
-      <w:rFonts w:eastAsiaTheme="majorEastAsia" w:cstheme="minorHAnsi"/>
-      <w:b/>
-      <w:bCs/>
-      <w:color w:val="4F81BD" w:themeColor="accent1"/>
-      <w:sz w:val="28"/>
-      <w:szCs w:val="28"/>
+      <w:rFonts w:ascii="Arial" w:eastAsiaTheme="majorEastAsia" w:hAnsi="Arial" w:cstheme="majorBidi"/>
+      <w:color w:val="243F60" w:themeColor="accent1" w:themeShade="7F"/>
+      <w:sz w:val="32"/>
+      <w:szCs w:val="24"/>
     </w:rPr>
   </w:style>
   <w:style w:type="paragraph" w:styleId="Heading4">
@@ -591,16 +552,15 @@
     <w:uiPriority w:val="9"/>
     <w:unhideWhenUsed/>
     <w:qFormat/>
-    <w:rsid w:val="00DF130E"/>
+    <w:rsid w:val="001716AF"/>
     <w:pPr>
       <w:keepNext/>
       <w:keepLines/>
-      <w:spacing w:before="240" w:after="120"/>
+      <w:spacing w:after="0"/>
       <w:outlineLvl w:val="3"/>
     </w:pPr>
     <w:rPr>
-      <w:rFonts w:eastAsiaTheme="majorEastAsia" w:cstheme="minorHAnsi"/>
-      <w:b/>
+      <w:rFonts w:ascii="Arial" w:eastAsiaTheme="majorEastAsia" w:hAnsi="Arial" w:cs="Arial"/>
       <w:bCs/>
       <w:iCs/>
     </w:rPr>
@@ -638,7 +598,7 @@
     <w:link w:val="HeaderChar"/>
     <w:uiPriority w:val="99"/>
     <w:unhideWhenUsed/>
-    <w:rsid w:val="00E043FD"/>
+    <w:rsid w:val="00037B15"/>
     <w:pPr>
       <w:tabs>
         <w:tab w:val="center" w:pos="4513"/>
@@ -653,6 +613,9 @@
     <w:link w:val="Header"/>
     <w:uiPriority w:val="99"/>
     <w:rsid w:val="00E043FD"/>
+    <w:rPr>
+      <w:sz w:val="28"/>
+    </w:rPr>
   </w:style>
   <w:style w:type="paragraph" w:styleId="Footer">
     <w:name w:val="footer"/>
@@ -660,7 +623,7 @@
     <w:link w:val="FooterChar"/>
     <w:uiPriority w:val="99"/>
     <w:unhideWhenUsed/>
-    <w:rsid w:val="00E043FD"/>
+    <w:rsid w:val="00037B15"/>
     <w:pPr>
       <w:tabs>
         <w:tab w:val="center" w:pos="4513"/>
@@ -675,6 +638,9 @@
     <w:link w:val="Footer"/>
     <w:uiPriority w:val="99"/>
     <w:rsid w:val="00E043FD"/>
+    <w:rPr>
+      <w:sz w:val="28"/>
+    </w:rPr>
   </w:style>
   <w:style w:type="paragraph" w:customStyle="1" w:styleId="3CBD5A742C28424DA5172AD252E32316">
     <w:name w:val="3CBD5A742C28424DA5172AD252E32316"/>
@@ -773,7 +739,7 @@
     <w:basedOn w:val="DefaultParagraphFont"/>
     <w:link w:val="Heading2"/>
     <w:uiPriority w:val="9"/>
-    <w:rsid w:val="00F14C3E"/>
+    <w:rsid w:val="00B467BA"/>
     <w:rPr>
       <w:rFonts w:eastAsiaTheme="majorEastAsia" w:cstheme="minorHAnsi"/>
       <w:b/>
@@ -786,11 +752,15 @@
   <w:style w:type="paragraph" w:styleId="ListParagraph">
     <w:name w:val="List Paragraph"/>
     <w:basedOn w:val="Normal"/>
+    <w:link w:val="ListParagraphChar"/>
     <w:uiPriority w:val="34"/>
     <w:qFormat/>
-    <w:rsid w:val="0085261D"/>
-    <w:pPr>
-      <w:ind w:left="720"/>
+    <w:rsid w:val="002E72C0"/>
+    <w:pPr>
+      <w:numPr>
+        <w:numId w:val="1"/>
+      </w:numPr>
+      <w:spacing w:after="120"/>
       <w:contextualSpacing/>
     </w:pPr>
   </w:style>
@@ -799,14 +769,12 @@
     <w:basedOn w:val="DefaultParagraphFont"/>
     <w:link w:val="Heading3"/>
     <w:uiPriority w:val="9"/>
-    <w:rsid w:val="00B8774B"/>
-    <w:rPr>
-      <w:rFonts w:eastAsiaTheme="majorEastAsia" w:cstheme="minorHAnsi"/>
-      <w:b/>
-      <w:bCs/>
-      <w:color w:val="4F81BD" w:themeColor="accent1"/>
-      <w:sz w:val="28"/>
-      <w:szCs w:val="28"/>
+    <w:rsid w:val="001716AF"/>
+    <w:rPr>
+      <w:rFonts w:ascii="Arial" w:eastAsiaTheme="majorEastAsia" w:hAnsi="Arial" w:cstheme="majorBidi"/>
+      <w:color w:val="243F60" w:themeColor="accent1" w:themeShade="7F"/>
+      <w:sz w:val="32"/>
+      <w:szCs w:val="24"/>
     </w:rPr>
   </w:style>
   <w:style w:type="character" w:customStyle="1" w:styleId="Heading4Char">
@@ -814,12 +782,63 @@
     <w:basedOn w:val="DefaultParagraphFont"/>
     <w:link w:val="Heading4"/>
     <w:uiPriority w:val="9"/>
-    <w:rsid w:val="00DF130E"/>
-    <w:rPr>
-      <w:rFonts w:eastAsiaTheme="majorEastAsia" w:cstheme="minorHAnsi"/>
-      <w:b/>
+    <w:rsid w:val="001716AF"/>
+    <w:rPr>
+      <w:rFonts w:ascii="Arial" w:eastAsiaTheme="majorEastAsia" w:hAnsi="Arial" w:cs="Arial"/>
       <w:bCs/>
       <w:iCs/>
+      <w:sz w:val="28"/>
+    </w:rPr>
+  </w:style>
+  <w:style w:type="paragraph" w:styleId="NoSpacing">
+    <w:name w:val="No Spacing"/>
+    <w:uiPriority w:val="1"/>
+    <w:qFormat/>
+    <w:rsid w:val="00037B15"/>
+    <w:pPr>
+      <w:spacing w:after="0" w:line="240" w:lineRule="auto"/>
+    </w:pPr>
+    <w:rPr>
+      <w:sz w:val="28"/>
+    </w:rPr>
+  </w:style>
+  <w:style w:type="paragraph" w:styleId="Revision">
+    <w:name w:val="Revision"/>
+    <w:hidden/>
+    <w:uiPriority w:val="99"/>
+    <w:semiHidden/>
+    <w:rsid w:val="00037B15"/>
+    <w:pPr>
+      <w:spacing w:after="0" w:line="240" w:lineRule="auto"/>
+    </w:pPr>
+  </w:style>
+  <w:style w:type="paragraph" w:customStyle="1" w:styleId="Bulleted">
+    <w:name w:val="Bulleted"/>
+    <w:basedOn w:val="ListParagraph"/>
+    <w:link w:val="BulletedChar"/>
+    <w:qFormat/>
+    <w:rsid w:val="006E24A1"/>
+    <w:pPr>
+      <w:spacing w:after="0"/>
+    </w:pPr>
+  </w:style>
+  <w:style w:type="character" w:customStyle="1" w:styleId="ListParagraphChar">
+    <w:name w:val="List Paragraph Char"/>
+    <w:basedOn w:val="DefaultParagraphFont"/>
+    <w:link w:val="ListParagraph"/>
+    <w:uiPriority w:val="34"/>
+    <w:rsid w:val="006E24A1"/>
+    <w:rPr>
+      <w:sz w:val="28"/>
+    </w:rPr>
+  </w:style>
+  <w:style w:type="character" w:customStyle="1" w:styleId="BulletedChar">
+    <w:name w:val="Bulleted Char"/>
+    <w:basedOn w:val="ListParagraphChar"/>
+    <w:link w:val="Bulleted"/>
+    <w:rsid w:val="006E24A1"/>
+    <w:rPr>
+      <w:sz w:val="28"/>
     </w:rPr>
   </w:style>
 </w:styles>
@@ -984,6 +1003,10 @@
   <w:style w:type="paragraph" w:default="1" w:styleId="Normal">
     <w:name w:val="Normal"/>
     <w:qFormat/>
+    <w:rsid w:val="00682500"/>
+    <w:rPr>
+      <w:sz w:val="28"/>
+    </w:rPr>
   </w:style>
   <w:style w:type="paragraph" w:styleId="Heading1">
     <w:name w:val="heading 1"/>
@@ -1019,7 +1042,7 @@
     <w:uiPriority w:val="9"/>
     <w:unhideWhenUsed/>
     <w:qFormat/>
-    <w:rsid w:val="00F14C3E"/>
+    <w:rsid w:val="00B467BA"/>
     <w:pPr>
       <w:keepNext/>
       <w:keepLines/>
@@ -1043,20 +1066,18 @@
     <w:uiPriority w:val="9"/>
     <w:unhideWhenUsed/>
     <w:qFormat/>
-    <w:rsid w:val="00B8774B"/>
+    <w:rsid w:val="001716AF"/>
     <w:pPr>
       <w:keepNext/>
       <w:keepLines/>
-      <w:spacing w:before="200" w:after="0"/>
+      <w:spacing w:before="120" w:after="0"/>
       <w:outlineLvl w:val="2"/>
     </w:pPr>
     <w:rPr>
-      <w:rFonts w:eastAsiaTheme="majorEastAsia" w:cstheme="minorHAnsi"/>
-      <w:b/>
-      <w:bCs/>
-      <w:color w:val="4F81BD" w:themeColor="accent1"/>
-      <w:sz w:val="28"/>
-      <w:szCs w:val="28"/>
+      <w:rFonts w:ascii="Arial" w:eastAsiaTheme="majorEastAsia" w:hAnsi="Arial" w:cstheme="majorBidi"/>
+      <w:color w:val="243F60" w:themeColor="accent1" w:themeShade="7F"/>
+      <w:sz w:val="32"/>
+      <w:szCs w:val="24"/>
     </w:rPr>
   </w:style>
   <w:style w:type="paragraph" w:styleId="Heading4">
@@ -1067,16 +1088,15 @@
     <w:uiPriority w:val="9"/>
     <w:unhideWhenUsed/>
     <w:qFormat/>
-    <w:rsid w:val="00DF130E"/>
+    <w:rsid w:val="001716AF"/>
     <w:pPr>
       <w:keepNext/>
       <w:keepLines/>
-      <w:spacing w:before="240" w:after="120"/>
+      <w:spacing w:after="0"/>
       <w:outlineLvl w:val="3"/>
     </w:pPr>
     <w:rPr>
-      <w:rFonts w:eastAsiaTheme="majorEastAsia" w:cstheme="minorHAnsi"/>
-      <w:b/>
+      <w:rFonts w:ascii="Arial" w:eastAsiaTheme="majorEastAsia" w:hAnsi="Arial" w:cs="Arial"/>
       <w:bCs/>
       <w:iCs/>
     </w:rPr>
@@ -1114,7 +1134,7 @@
     <w:link w:val="HeaderChar"/>
     <w:uiPriority w:val="99"/>
     <w:unhideWhenUsed/>
-    <w:rsid w:val="00E043FD"/>
+    <w:rsid w:val="00037B15"/>
     <w:pPr>
       <w:tabs>
         <w:tab w:val="center" w:pos="4513"/>
@@ -1129,6 +1149,9 @@
     <w:link w:val="Header"/>
     <w:uiPriority w:val="99"/>
     <w:rsid w:val="00E043FD"/>
+    <w:rPr>
+      <w:sz w:val="28"/>
+    </w:rPr>
   </w:style>
   <w:style w:type="paragraph" w:styleId="Footer">
     <w:name w:val="footer"/>
@@ -1136,7 +1159,7 @@
     <w:link w:val="FooterChar"/>
     <w:uiPriority w:val="99"/>
     <w:unhideWhenUsed/>
-    <w:rsid w:val="00E043FD"/>
+    <w:rsid w:val="00037B15"/>
     <w:pPr>
       <w:tabs>
         <w:tab w:val="center" w:pos="4513"/>
@@ -1151,6 +1174,9 @@
     <w:link w:val="Footer"/>
     <w:uiPriority w:val="99"/>
     <w:rsid w:val="00E043FD"/>
+    <w:rPr>
+      <w:sz w:val="28"/>
+    </w:rPr>
   </w:style>
   <w:style w:type="paragraph" w:customStyle="1" w:styleId="3CBD5A742C28424DA5172AD252E32316">
     <w:name w:val="3CBD5A742C28424DA5172AD252E32316"/>
@@ -1249,7 +1275,7 @@
     <w:basedOn w:val="DefaultParagraphFont"/>
     <w:link w:val="Heading2"/>
     <w:uiPriority w:val="9"/>
-    <w:rsid w:val="00F14C3E"/>
+    <w:rsid w:val="00B467BA"/>
     <w:rPr>
       <w:rFonts w:eastAsiaTheme="majorEastAsia" w:cstheme="minorHAnsi"/>
       <w:b/>
@@ -1262,11 +1288,15 @@
   <w:style w:type="paragraph" w:styleId="ListParagraph">
     <w:name w:val="List Paragraph"/>
     <w:basedOn w:val="Normal"/>
+    <w:link w:val="ListParagraphChar"/>
     <w:uiPriority w:val="34"/>
     <w:qFormat/>
-    <w:rsid w:val="0085261D"/>
-    <w:pPr>
-      <w:ind w:left="720"/>
+    <w:rsid w:val="002E72C0"/>
+    <w:pPr>
+      <w:numPr>
+        <w:numId w:val="1"/>
+      </w:numPr>
+      <w:spacing w:after="120"/>
       <w:contextualSpacing/>
     </w:pPr>
   </w:style>
@@ -1275,14 +1305,12 @@
     <w:basedOn w:val="DefaultParagraphFont"/>
     <w:link w:val="Heading3"/>
     <w:uiPriority w:val="9"/>
-    <w:rsid w:val="00B8774B"/>
-    <w:rPr>
-      <w:rFonts w:eastAsiaTheme="majorEastAsia" w:cstheme="minorHAnsi"/>
-      <w:b/>
-      <w:bCs/>
-      <w:color w:val="4F81BD" w:themeColor="accent1"/>
-      <w:sz w:val="28"/>
-      <w:szCs w:val="28"/>
+    <w:rsid w:val="001716AF"/>
+    <w:rPr>
+      <w:rFonts w:ascii="Arial" w:eastAsiaTheme="majorEastAsia" w:hAnsi="Arial" w:cstheme="majorBidi"/>
+      <w:color w:val="243F60" w:themeColor="accent1" w:themeShade="7F"/>
+      <w:sz w:val="32"/>
+      <w:szCs w:val="24"/>
     </w:rPr>
   </w:style>
   <w:style w:type="character" w:customStyle="1" w:styleId="Heading4Char">
@@ -1290,12 +1318,63 @@
     <w:basedOn w:val="DefaultParagraphFont"/>
     <w:link w:val="Heading4"/>
     <w:uiPriority w:val="9"/>
-    <w:rsid w:val="00DF130E"/>
-    <w:rPr>
-      <w:rFonts w:eastAsiaTheme="majorEastAsia" w:cstheme="minorHAnsi"/>
-      <w:b/>
+    <w:rsid w:val="001716AF"/>
+    <w:rPr>
+      <w:rFonts w:ascii="Arial" w:eastAsiaTheme="majorEastAsia" w:hAnsi="Arial" w:cs="Arial"/>
       <w:bCs/>
       <w:iCs/>
+      <w:sz w:val="28"/>
+    </w:rPr>
+  </w:style>
+  <w:style w:type="paragraph" w:styleId="NoSpacing">
+    <w:name w:val="No Spacing"/>
+    <w:uiPriority w:val="1"/>
+    <w:qFormat/>
+    <w:rsid w:val="00037B15"/>
+    <w:pPr>
+      <w:spacing w:after="0" w:line="240" w:lineRule="auto"/>
+    </w:pPr>
+    <w:rPr>
+      <w:sz w:val="28"/>
+    </w:rPr>
+  </w:style>
+  <w:style w:type="paragraph" w:styleId="Revision">
+    <w:name w:val="Revision"/>
+    <w:hidden/>
+    <w:uiPriority w:val="99"/>
+    <w:semiHidden/>
+    <w:rsid w:val="00037B15"/>
+    <w:pPr>
+      <w:spacing w:after="0" w:line="240" w:lineRule="auto"/>
+    </w:pPr>
+  </w:style>
+  <w:style w:type="paragraph" w:customStyle="1" w:styleId="Bulleted">
+    <w:name w:val="Bulleted"/>
+    <w:basedOn w:val="ListParagraph"/>
+    <w:link w:val="BulletedChar"/>
+    <w:qFormat/>
+    <w:rsid w:val="006E24A1"/>
+    <w:pPr>
+      <w:spacing w:after="0"/>
+    </w:pPr>
+  </w:style>
+  <w:style w:type="character" w:customStyle="1" w:styleId="ListParagraphChar">
+    <w:name w:val="List Paragraph Char"/>
+    <w:basedOn w:val="DefaultParagraphFont"/>
+    <w:link w:val="ListParagraph"/>
+    <w:uiPriority w:val="34"/>
+    <w:rsid w:val="006E24A1"/>
+    <w:rPr>
+      <w:sz w:val="28"/>
+    </w:rPr>
+  </w:style>
+  <w:style w:type="character" w:customStyle="1" w:styleId="BulletedChar">
+    <w:name w:val="Bulleted Char"/>
+    <w:basedOn w:val="ListParagraphChar"/>
+    <w:link w:val="Bulleted"/>
+    <w:rsid w:val="006E24A1"/>
+    <w:rPr>
+      <w:sz w:val="28"/>
     </w:rPr>
   </w:style>
 </w:styles>
@@ -1591,7 +1670,7 @@
 </file>
 
 <file path=customXml/itemProps1.xml><?xml version="1.0" encoding="utf-8"?>
-<ds:datastoreItem xmlns:ds="http://schemas.openxmlformats.org/officeDocument/2006/customXml" ds:itemID="{74202ACB-5DD1-43B7-B8CC-343004FA02AE}">
+<ds:datastoreItem xmlns:ds="http://schemas.openxmlformats.org/officeDocument/2006/customXml" ds:itemID="{32E481A7-814D-4B58-9E32-0B4373C0317E}">
   <ds:schemaRefs>
     <ds:schemaRef ds:uri="http://schemas.openxmlformats.org/officeDocument/2006/bibliography"/>
   </ds:schemaRefs>

</xml_diff>

<commit_message>
Reduced font size to 11pt in footer
</commit_message>
<xml_diff>
--- a/manual-template.docx
+++ b/manual-template.docx
@@ -1,6 +1,6 @@
 
 <file path=word/document.xml><?xml version="1.0" encoding="utf-8"?>
-<w:document xmlns:wpc="http://schemas.microsoft.com/office/word/2010/wordprocessingCanvas" xmlns:mc="http://schemas.openxmlformats.org/markup-compatibility/2006" xmlns:o="urn:schemas-microsoft-com:office:office" xmlns:r="http://schemas.openxmlformats.org/officeDocument/2006/relationships" xmlns:m="http://schemas.openxmlformats.org/officeDocument/2006/math" xmlns:v="urn:schemas-microsoft-com:vml" xmlns:wp14="http://schemas.microsoft.com/office/word/2010/wordprocessingDrawing" xmlns:wp="http://schemas.openxmlformats.org/drawingml/2006/wordprocessingDrawing" xmlns:w10="urn:schemas-microsoft-com:office:word" xmlns:w="http://schemas.openxmlformats.org/wordprocessingml/2006/main" xmlns:w14="http://schemas.microsoft.com/office/word/2010/wordml" xmlns:wpg="http://schemas.microsoft.com/office/word/2010/wordprocessingGroup" xmlns:wpi="http://schemas.microsoft.com/office/word/2010/wordprocessingInk" xmlns:wne="http://schemas.microsoft.com/office/word/2006/wordml" xmlns:wps="http://schemas.microsoft.com/office/word/2010/wordprocessingShape" mc:Ignorable="w14 wp14">
+<w:document xmlns:wpc="http://schemas.microsoft.com/office/word/2010/wordprocessingCanvas" xmlns:cx="http://schemas.microsoft.com/office/drawing/2014/chartex" xmlns:cx1="http://schemas.microsoft.com/office/drawing/2015/9/8/chartex" xmlns:cx2="http://schemas.microsoft.com/office/drawing/2015/10/21/chartex" xmlns:cx3="http://schemas.microsoft.com/office/drawing/2016/5/9/chartex" xmlns:cx4="http://schemas.microsoft.com/office/drawing/2016/5/10/chartex" xmlns:cx5="http://schemas.microsoft.com/office/drawing/2016/5/11/chartex" xmlns:cx6="http://schemas.microsoft.com/office/drawing/2016/5/12/chartex" xmlns:cx7="http://schemas.microsoft.com/office/drawing/2016/5/13/chartex" xmlns:cx8="http://schemas.microsoft.com/office/drawing/2016/5/14/chartex" xmlns:mc="http://schemas.openxmlformats.org/markup-compatibility/2006" xmlns:aink="http://schemas.microsoft.com/office/drawing/2016/ink" xmlns:am3d="http://schemas.microsoft.com/office/drawing/2017/model3d" xmlns:o="urn:schemas-microsoft-com:office:office" xmlns:oel="http://schemas.microsoft.com/office/2019/extlst" xmlns:r="http://schemas.openxmlformats.org/officeDocument/2006/relationships" xmlns:m="http://schemas.openxmlformats.org/officeDocument/2006/math" xmlns:v="urn:schemas-microsoft-com:vml" xmlns:wp14="http://schemas.microsoft.com/office/word/2010/wordprocessingDrawing" xmlns:wp="http://schemas.openxmlformats.org/drawingml/2006/wordprocessingDrawing" xmlns:w10="urn:schemas-microsoft-com:office:word" xmlns:w="http://schemas.openxmlformats.org/wordprocessingml/2006/main" xmlns:w14="http://schemas.microsoft.com/office/word/2010/wordml" xmlns:w15="http://schemas.microsoft.com/office/word/2012/wordml" xmlns:w16cex="http://schemas.microsoft.com/office/word/2018/wordml/cex" xmlns:w16cid="http://schemas.microsoft.com/office/word/2016/wordml/cid" xmlns:w16="http://schemas.microsoft.com/office/word/2018/wordml" xmlns:w16du="http://schemas.microsoft.com/office/word/2023/wordml/word16du" xmlns:w16sdtdh="http://schemas.microsoft.com/office/word/2020/wordml/sdtdatahash" xmlns:w16sdtfl="http://schemas.microsoft.com/office/word/2024/wordml/sdtformatlock" xmlns:w16se="http://schemas.microsoft.com/office/word/2015/wordml/symex" xmlns:wpg="http://schemas.microsoft.com/office/word/2010/wordprocessingGroup" xmlns:wpi="http://schemas.microsoft.com/office/word/2010/wordprocessingInk" xmlns:wne="http://schemas.microsoft.com/office/word/2006/wordml" xmlns:wps="http://schemas.microsoft.com/office/word/2010/wordprocessingShape" mc:Ignorable="w14 w15 w16se w16cid w16 w16cex w16sdtdh w16sdtfl w16du wp14">
   <w:body>
     <w:p>
       <w:pPr>
@@ -64,11 +64,14 @@
       <w:r>
         <w:t>Normal text</w:t>
       </w:r>
-      <w:bookmarkStart w:id="0" w:name="_GoBack"/>
-      <w:bookmarkEnd w:id="0"/>
     </w:p>
     <w:sectPr>
-      <w:footerReference w:type="default" r:id="rId9"/>
+      <w:headerReference w:type="even" r:id="rId8"/>
+      <w:headerReference w:type="default" r:id="rId9"/>
+      <w:footerReference w:type="even" r:id="rId10"/>
+      <w:footerReference w:type="default" r:id="rId11"/>
+      <w:headerReference w:type="first" r:id="rId12"/>
+      <w:footerReference w:type="first" r:id="rId13"/>
       <w:pgSz w:w="12240" w:h="15840" w:code="1"/>
       <w:pgMar w:top="1440" w:right="1440" w:bottom="1440" w:left="1440" w:header="708" w:footer="708" w:gutter="0"/>
       <w:cols w:space="708"/>
@@ -79,7 +82,7 @@
 </file>
 
 <file path=word/endnotes.xml><?xml version="1.0" encoding="utf-8"?>
-<w:endnotes xmlns:wpc="http://schemas.microsoft.com/office/word/2010/wordprocessingCanvas" xmlns:mc="http://schemas.openxmlformats.org/markup-compatibility/2006" xmlns:o="urn:schemas-microsoft-com:office:office" xmlns:r="http://schemas.openxmlformats.org/officeDocument/2006/relationships" xmlns:m="http://schemas.openxmlformats.org/officeDocument/2006/math" xmlns:v="urn:schemas-microsoft-com:vml" xmlns:wp14="http://schemas.microsoft.com/office/word/2010/wordprocessingDrawing" xmlns:wp="http://schemas.openxmlformats.org/drawingml/2006/wordprocessingDrawing" xmlns:w10="urn:schemas-microsoft-com:office:word" xmlns:w="http://schemas.openxmlformats.org/wordprocessingml/2006/main" xmlns:w14="http://schemas.microsoft.com/office/word/2010/wordml" xmlns:wpg="http://schemas.microsoft.com/office/word/2010/wordprocessingGroup" xmlns:wpi="http://schemas.microsoft.com/office/word/2010/wordprocessingInk" xmlns:wne="http://schemas.microsoft.com/office/word/2006/wordml" xmlns:wps="http://schemas.microsoft.com/office/word/2010/wordprocessingShape" mc:Ignorable="w14 wp14">
+<w:endnotes xmlns:wpc="http://schemas.microsoft.com/office/word/2010/wordprocessingCanvas" xmlns:cx="http://schemas.microsoft.com/office/drawing/2014/chartex" xmlns:cx1="http://schemas.microsoft.com/office/drawing/2015/9/8/chartex" xmlns:cx2="http://schemas.microsoft.com/office/drawing/2015/10/21/chartex" xmlns:cx3="http://schemas.microsoft.com/office/drawing/2016/5/9/chartex" xmlns:cx4="http://schemas.microsoft.com/office/drawing/2016/5/10/chartex" xmlns:cx5="http://schemas.microsoft.com/office/drawing/2016/5/11/chartex" xmlns:cx6="http://schemas.microsoft.com/office/drawing/2016/5/12/chartex" xmlns:cx7="http://schemas.microsoft.com/office/drawing/2016/5/13/chartex" xmlns:cx8="http://schemas.microsoft.com/office/drawing/2016/5/14/chartex" xmlns:mc="http://schemas.openxmlformats.org/markup-compatibility/2006" xmlns:aink="http://schemas.microsoft.com/office/drawing/2016/ink" xmlns:am3d="http://schemas.microsoft.com/office/drawing/2017/model3d" xmlns:o="urn:schemas-microsoft-com:office:office" xmlns:oel="http://schemas.microsoft.com/office/2019/extlst" xmlns:r="http://schemas.openxmlformats.org/officeDocument/2006/relationships" xmlns:m="http://schemas.openxmlformats.org/officeDocument/2006/math" xmlns:v="urn:schemas-microsoft-com:vml" xmlns:wp14="http://schemas.microsoft.com/office/word/2010/wordprocessingDrawing" xmlns:wp="http://schemas.openxmlformats.org/drawingml/2006/wordprocessingDrawing" xmlns:w10="urn:schemas-microsoft-com:office:word" xmlns:w="http://schemas.openxmlformats.org/wordprocessingml/2006/main" xmlns:w14="http://schemas.microsoft.com/office/word/2010/wordml" xmlns:w15="http://schemas.microsoft.com/office/word/2012/wordml" xmlns:w16cex="http://schemas.microsoft.com/office/word/2018/wordml/cex" xmlns:w16cid="http://schemas.microsoft.com/office/word/2016/wordml/cid" xmlns:w16="http://schemas.microsoft.com/office/word/2018/wordml" xmlns:w16du="http://schemas.microsoft.com/office/word/2023/wordml/word16du" xmlns:w16sdtdh="http://schemas.microsoft.com/office/word/2020/wordml/sdtdatahash" xmlns:w16sdtfl="http://schemas.microsoft.com/office/word/2024/wordml/sdtformatlock" xmlns:w16se="http://schemas.microsoft.com/office/word/2015/wordml/symex" xmlns:wpg="http://schemas.microsoft.com/office/word/2010/wordprocessingGroup" xmlns:wpi="http://schemas.microsoft.com/office/word/2010/wordprocessingInk" xmlns:wne="http://schemas.microsoft.com/office/word/2006/wordml" xmlns:wps="http://schemas.microsoft.com/office/word/2010/wordprocessingShape" mc:Ignorable="w14 w15 w16se w16cid w16 w16cex w16sdtdh w16sdtfl w16du wp14">
   <w:endnote w:type="separator" w:id="-1">
     <w:p>
       <w:r>
@@ -101,71 +104,135 @@
 </file>
 
 <file path=word/footer1.xml><?xml version="1.0" encoding="utf-8"?>
-<w:ftr xmlns:wpc="http://schemas.microsoft.com/office/word/2010/wordprocessingCanvas" xmlns:mc="http://schemas.openxmlformats.org/markup-compatibility/2006" xmlns:o="urn:schemas-microsoft-com:office:office" xmlns:r="http://schemas.openxmlformats.org/officeDocument/2006/relationships" xmlns:m="http://schemas.openxmlformats.org/officeDocument/2006/math" xmlns:v="urn:schemas-microsoft-com:vml" xmlns:wp14="http://schemas.microsoft.com/office/word/2010/wordprocessingDrawing" xmlns:wp="http://schemas.openxmlformats.org/drawingml/2006/wordprocessingDrawing" xmlns:w10="urn:schemas-microsoft-com:office:word" xmlns:w="http://schemas.openxmlformats.org/wordprocessingml/2006/main" xmlns:w14="http://schemas.microsoft.com/office/word/2010/wordml" xmlns:wpg="http://schemas.microsoft.com/office/word/2010/wordprocessingGroup" xmlns:wpi="http://schemas.microsoft.com/office/word/2010/wordprocessingInk" xmlns:wne="http://schemas.microsoft.com/office/word/2006/wordml" xmlns:wps="http://schemas.microsoft.com/office/word/2010/wordprocessingShape" mc:Ignorable="w14 wp14">
+<w:ftr xmlns:wpc="http://schemas.microsoft.com/office/word/2010/wordprocessingCanvas" xmlns:cx="http://schemas.microsoft.com/office/drawing/2014/chartex" xmlns:cx1="http://schemas.microsoft.com/office/drawing/2015/9/8/chartex" xmlns:cx2="http://schemas.microsoft.com/office/drawing/2015/10/21/chartex" xmlns:cx3="http://schemas.microsoft.com/office/drawing/2016/5/9/chartex" xmlns:cx4="http://schemas.microsoft.com/office/drawing/2016/5/10/chartex" xmlns:cx5="http://schemas.microsoft.com/office/drawing/2016/5/11/chartex" xmlns:cx6="http://schemas.microsoft.com/office/drawing/2016/5/12/chartex" xmlns:cx7="http://schemas.microsoft.com/office/drawing/2016/5/13/chartex" xmlns:cx8="http://schemas.microsoft.com/office/drawing/2016/5/14/chartex" xmlns:mc="http://schemas.openxmlformats.org/markup-compatibility/2006" xmlns:aink="http://schemas.microsoft.com/office/drawing/2016/ink" xmlns:am3d="http://schemas.microsoft.com/office/drawing/2017/model3d" xmlns:o="urn:schemas-microsoft-com:office:office" xmlns:oel="http://schemas.microsoft.com/office/2019/extlst" xmlns:r="http://schemas.openxmlformats.org/officeDocument/2006/relationships" xmlns:m="http://schemas.openxmlformats.org/officeDocument/2006/math" xmlns:v="urn:schemas-microsoft-com:vml" xmlns:wp14="http://schemas.microsoft.com/office/word/2010/wordprocessingDrawing" xmlns:wp="http://schemas.openxmlformats.org/drawingml/2006/wordprocessingDrawing" xmlns:w10="urn:schemas-microsoft-com:office:word" xmlns:w="http://schemas.openxmlformats.org/wordprocessingml/2006/main" xmlns:w14="http://schemas.microsoft.com/office/word/2010/wordml" xmlns:w15="http://schemas.microsoft.com/office/word/2012/wordml" xmlns:w16cex="http://schemas.microsoft.com/office/word/2018/wordml/cex" xmlns:w16cid="http://schemas.microsoft.com/office/word/2016/wordml/cid" xmlns:w16="http://schemas.microsoft.com/office/word/2018/wordml" xmlns:w16du="http://schemas.microsoft.com/office/word/2023/wordml/word16du" xmlns:w16sdtdh="http://schemas.microsoft.com/office/word/2020/wordml/sdtdatahash" xmlns:w16sdtfl="http://schemas.microsoft.com/office/word/2024/wordml/sdtformatlock" xmlns:w16se="http://schemas.microsoft.com/office/word/2015/wordml/symex" xmlns:wpg="http://schemas.microsoft.com/office/word/2010/wordprocessingGroup" xmlns:wpi="http://schemas.microsoft.com/office/word/2010/wordprocessingInk" xmlns:wne="http://schemas.microsoft.com/office/word/2006/wordml" xmlns:wps="http://schemas.microsoft.com/office/word/2010/wordprocessingShape" mc:Ignorable="w14 w15 w16se w16cid w16 w16cex w16sdtdh w16sdtfl w16du wp14">
+  <w:p>
+    <w:pPr>
+      <w:pStyle w:val="Footer"/>
+    </w:pPr>
+  </w:p>
+</w:ftr>
+</file>
+
+<file path=word/footer2.xml><?xml version="1.0" encoding="utf-8"?>
+<w:ftr xmlns:wpc="http://schemas.microsoft.com/office/word/2010/wordprocessingCanvas" xmlns:cx="http://schemas.microsoft.com/office/drawing/2014/chartex" xmlns:cx1="http://schemas.microsoft.com/office/drawing/2015/9/8/chartex" xmlns:cx2="http://schemas.microsoft.com/office/drawing/2015/10/21/chartex" xmlns:cx3="http://schemas.microsoft.com/office/drawing/2016/5/9/chartex" xmlns:cx4="http://schemas.microsoft.com/office/drawing/2016/5/10/chartex" xmlns:cx5="http://schemas.microsoft.com/office/drawing/2016/5/11/chartex" xmlns:cx6="http://schemas.microsoft.com/office/drawing/2016/5/12/chartex" xmlns:cx7="http://schemas.microsoft.com/office/drawing/2016/5/13/chartex" xmlns:cx8="http://schemas.microsoft.com/office/drawing/2016/5/14/chartex" xmlns:mc="http://schemas.openxmlformats.org/markup-compatibility/2006" xmlns:aink="http://schemas.microsoft.com/office/drawing/2016/ink" xmlns:am3d="http://schemas.microsoft.com/office/drawing/2017/model3d" xmlns:o="urn:schemas-microsoft-com:office:office" xmlns:oel="http://schemas.microsoft.com/office/2019/extlst" xmlns:r="http://schemas.openxmlformats.org/officeDocument/2006/relationships" xmlns:m="http://schemas.openxmlformats.org/officeDocument/2006/math" xmlns:v="urn:schemas-microsoft-com:vml" xmlns:wp14="http://schemas.microsoft.com/office/word/2010/wordprocessingDrawing" xmlns:wp="http://schemas.openxmlformats.org/drawingml/2006/wordprocessingDrawing" xmlns:w10="urn:schemas-microsoft-com:office:word" xmlns:w="http://schemas.openxmlformats.org/wordprocessingml/2006/main" xmlns:w14="http://schemas.microsoft.com/office/word/2010/wordml" xmlns:w15="http://schemas.microsoft.com/office/word/2012/wordml" xmlns:w16cex="http://schemas.microsoft.com/office/word/2018/wordml/cex" xmlns:w16cid="http://schemas.microsoft.com/office/word/2016/wordml/cid" xmlns:w16="http://schemas.microsoft.com/office/word/2018/wordml" xmlns:w16du="http://schemas.microsoft.com/office/word/2023/wordml/word16du" xmlns:w16sdtdh="http://schemas.microsoft.com/office/word/2020/wordml/sdtdatahash" xmlns:w16sdtfl="http://schemas.microsoft.com/office/word/2024/wordml/sdtformatlock" xmlns:w16se="http://schemas.microsoft.com/office/word/2015/wordml/symex" xmlns:wpg="http://schemas.microsoft.com/office/word/2010/wordprocessingGroup" xmlns:wpi="http://schemas.microsoft.com/office/word/2010/wordprocessingInk" xmlns:wne="http://schemas.microsoft.com/office/word/2006/wordml" xmlns:wps="http://schemas.microsoft.com/office/word/2010/wordprocessingShape" mc:Ignorable="w14 w15 w16se w16cid w16 w16cex w16sdtdh w16sdtfl w16du wp14">
   <w:p>
     <w:pPr>
       <w:pStyle w:val="Footer"/>
       <w:pBdr>
         <w:top w:val="single" w:sz="4" w:space="1" w:color="auto"/>
       </w:pBdr>
+      <w:rPr>
+        <w:sz w:val="22"/>
+      </w:rPr>
     </w:pPr>
     <w:r>
+      <w:rPr>
+        <w:sz w:val="22"/>
+      </w:rPr>
       <w:t>Sound Foundations NW</w:t>
     </w:r>
     <w:r>
+      <w:rPr>
+        <w:sz w:val="22"/>
+      </w:rPr>
       <w:ptab w:relativeTo="margin" w:alignment="center" w:leader="none"/>
     </w:r>
     <w:r>
+      <w:rPr>
+        <w:sz w:val="22"/>
+      </w:rPr>
       <w:t xml:space="preserve"> </w:t>
     </w:r>
     <w:r>
+      <w:rPr>
+        <w:sz w:val="22"/>
+      </w:rPr>
       <w:fldChar w:fldCharType="begin"/>
     </w:r>
     <w:r>
+      <w:rPr>
+        <w:sz w:val="22"/>
+      </w:rPr>
       <w:instrText xml:space="preserve"> SAVEDATE  \@ "d MMMM yyyy"  \* MERGEFORMAT </w:instrText>
     </w:r>
     <w:r>
+      <w:rPr>
+        <w:sz w:val="22"/>
+      </w:rPr>
       <w:fldChar w:fldCharType="separate"/>
     </w:r>
     <w:r>
       <w:rPr>
         <w:noProof/>
+        <w:sz w:val="22"/>
       </w:rPr>
       <w:t>12 March 2025</w:t>
     </w:r>
     <w:r>
+      <w:rPr>
+        <w:sz w:val="22"/>
+      </w:rPr>
       <w:fldChar w:fldCharType="end"/>
     </w:r>
     <w:r>
+      <w:rPr>
+        <w:sz w:val="22"/>
+      </w:rPr>
       <w:t xml:space="preserve"> </w:t>
     </w:r>
     <w:r>
+      <w:rPr>
+        <w:sz w:val="22"/>
+      </w:rPr>
       <w:ptab w:relativeTo="margin" w:alignment="right" w:leader="none"/>
     </w:r>
     <w:r>
+      <w:rPr>
+        <w:sz w:val="22"/>
+      </w:rPr>
       <w:fldChar w:fldCharType="begin"/>
     </w:r>
     <w:r>
+      <w:rPr>
+        <w:sz w:val="22"/>
+      </w:rPr>
       <w:instrText xml:space="preserve"> PAGE   \* MERGEFORMAT </w:instrText>
     </w:r>
     <w:r>
+      <w:rPr>
+        <w:sz w:val="22"/>
+      </w:rPr>
       <w:fldChar w:fldCharType="separate"/>
     </w:r>
     <w:r>
       <w:rPr>
         <w:noProof/>
+        <w:sz w:val="22"/>
       </w:rPr>
       <w:t>1</w:t>
     </w:r>
     <w:r>
+      <w:rPr>
+        <w:sz w:val="22"/>
+      </w:rPr>
       <w:fldChar w:fldCharType="end"/>
     </w:r>
   </w:p>
 </w:ftr>
 </file>
 
+<file path=word/footer3.xml><?xml version="1.0" encoding="utf-8"?>
+<w:ftr xmlns:wpc="http://schemas.microsoft.com/office/word/2010/wordprocessingCanvas" xmlns:cx="http://schemas.microsoft.com/office/drawing/2014/chartex" xmlns:cx1="http://schemas.microsoft.com/office/drawing/2015/9/8/chartex" xmlns:cx2="http://schemas.microsoft.com/office/drawing/2015/10/21/chartex" xmlns:cx3="http://schemas.microsoft.com/office/drawing/2016/5/9/chartex" xmlns:cx4="http://schemas.microsoft.com/office/drawing/2016/5/10/chartex" xmlns:cx5="http://schemas.microsoft.com/office/drawing/2016/5/11/chartex" xmlns:cx6="http://schemas.microsoft.com/office/drawing/2016/5/12/chartex" xmlns:cx7="http://schemas.microsoft.com/office/drawing/2016/5/13/chartex" xmlns:cx8="http://schemas.microsoft.com/office/drawing/2016/5/14/chartex" xmlns:mc="http://schemas.openxmlformats.org/markup-compatibility/2006" xmlns:aink="http://schemas.microsoft.com/office/drawing/2016/ink" xmlns:am3d="http://schemas.microsoft.com/office/drawing/2017/model3d" xmlns:o="urn:schemas-microsoft-com:office:office" xmlns:oel="http://schemas.microsoft.com/office/2019/extlst" xmlns:r="http://schemas.openxmlformats.org/officeDocument/2006/relationships" xmlns:m="http://schemas.openxmlformats.org/officeDocument/2006/math" xmlns:v="urn:schemas-microsoft-com:vml" xmlns:wp14="http://schemas.microsoft.com/office/word/2010/wordprocessingDrawing" xmlns:wp="http://schemas.openxmlformats.org/drawingml/2006/wordprocessingDrawing" xmlns:w10="urn:schemas-microsoft-com:office:word" xmlns:w="http://schemas.openxmlformats.org/wordprocessingml/2006/main" xmlns:w14="http://schemas.microsoft.com/office/word/2010/wordml" xmlns:w15="http://schemas.microsoft.com/office/word/2012/wordml" xmlns:w16cex="http://schemas.microsoft.com/office/word/2018/wordml/cex" xmlns:w16cid="http://schemas.microsoft.com/office/word/2016/wordml/cid" xmlns:w16="http://schemas.microsoft.com/office/word/2018/wordml" xmlns:w16du="http://schemas.microsoft.com/office/word/2023/wordml/word16du" xmlns:w16sdtdh="http://schemas.microsoft.com/office/word/2020/wordml/sdtdatahash" xmlns:w16sdtfl="http://schemas.microsoft.com/office/word/2024/wordml/sdtformatlock" xmlns:w16se="http://schemas.microsoft.com/office/word/2015/wordml/symex" xmlns:wpg="http://schemas.microsoft.com/office/word/2010/wordprocessingGroup" xmlns:wpi="http://schemas.microsoft.com/office/word/2010/wordprocessingInk" xmlns:wne="http://schemas.microsoft.com/office/word/2006/wordml" xmlns:wps="http://schemas.microsoft.com/office/word/2010/wordprocessingShape" mc:Ignorable="w14 w15 w16se w16cid w16 w16cex w16sdtdh w16sdtfl w16du wp14">
+  <w:p>
+    <w:pPr>
+      <w:pStyle w:val="Footer"/>
+    </w:pPr>
+  </w:p>
+</w:ftr>
+</file>
+
 <file path=word/footnotes.xml><?xml version="1.0" encoding="utf-8"?>
-<w:footnotes xmlns:wpc="http://schemas.microsoft.com/office/word/2010/wordprocessingCanvas" xmlns:mc="http://schemas.openxmlformats.org/markup-compatibility/2006" xmlns:o="urn:schemas-microsoft-com:office:office" xmlns:r="http://schemas.openxmlformats.org/officeDocument/2006/relationships" xmlns:m="http://schemas.openxmlformats.org/officeDocument/2006/math" xmlns:v="urn:schemas-microsoft-com:vml" xmlns:wp14="http://schemas.microsoft.com/office/word/2010/wordprocessingDrawing" xmlns:wp="http://schemas.openxmlformats.org/drawingml/2006/wordprocessingDrawing" xmlns:w10="urn:schemas-microsoft-com:office:word" xmlns:w="http://schemas.openxmlformats.org/wordprocessingml/2006/main" xmlns:w14="http://schemas.microsoft.com/office/word/2010/wordml" xmlns:wpg="http://schemas.microsoft.com/office/word/2010/wordprocessingGroup" xmlns:wpi="http://schemas.microsoft.com/office/word/2010/wordprocessingInk" xmlns:wne="http://schemas.microsoft.com/office/word/2006/wordml" xmlns:wps="http://schemas.microsoft.com/office/word/2010/wordprocessingShape" mc:Ignorable="w14 wp14">
+<w:footnotes xmlns:wpc="http://schemas.microsoft.com/office/word/2010/wordprocessingCanvas" xmlns:cx="http://schemas.microsoft.com/office/drawing/2014/chartex" xmlns:cx1="http://schemas.microsoft.com/office/drawing/2015/9/8/chartex" xmlns:cx2="http://schemas.microsoft.com/office/drawing/2015/10/21/chartex" xmlns:cx3="http://schemas.microsoft.com/office/drawing/2016/5/9/chartex" xmlns:cx4="http://schemas.microsoft.com/office/drawing/2016/5/10/chartex" xmlns:cx5="http://schemas.microsoft.com/office/drawing/2016/5/11/chartex" xmlns:cx6="http://schemas.microsoft.com/office/drawing/2016/5/12/chartex" xmlns:cx7="http://schemas.microsoft.com/office/drawing/2016/5/13/chartex" xmlns:cx8="http://schemas.microsoft.com/office/drawing/2016/5/14/chartex" xmlns:mc="http://schemas.openxmlformats.org/markup-compatibility/2006" xmlns:aink="http://schemas.microsoft.com/office/drawing/2016/ink" xmlns:am3d="http://schemas.microsoft.com/office/drawing/2017/model3d" xmlns:o="urn:schemas-microsoft-com:office:office" xmlns:oel="http://schemas.microsoft.com/office/2019/extlst" xmlns:r="http://schemas.openxmlformats.org/officeDocument/2006/relationships" xmlns:m="http://schemas.openxmlformats.org/officeDocument/2006/math" xmlns:v="urn:schemas-microsoft-com:vml" xmlns:wp14="http://schemas.microsoft.com/office/word/2010/wordprocessingDrawing" xmlns:wp="http://schemas.openxmlformats.org/drawingml/2006/wordprocessingDrawing" xmlns:w10="urn:schemas-microsoft-com:office:word" xmlns:w="http://schemas.openxmlformats.org/wordprocessingml/2006/main" xmlns:w14="http://schemas.microsoft.com/office/word/2010/wordml" xmlns:w15="http://schemas.microsoft.com/office/word/2012/wordml" xmlns:w16cex="http://schemas.microsoft.com/office/word/2018/wordml/cex" xmlns:w16cid="http://schemas.microsoft.com/office/word/2016/wordml/cid" xmlns:w16="http://schemas.microsoft.com/office/word/2018/wordml" xmlns:w16du="http://schemas.microsoft.com/office/word/2023/wordml/word16du" xmlns:w16sdtdh="http://schemas.microsoft.com/office/word/2020/wordml/sdtdatahash" xmlns:w16sdtfl="http://schemas.microsoft.com/office/word/2024/wordml/sdtformatlock" xmlns:w16se="http://schemas.microsoft.com/office/word/2015/wordml/symex" xmlns:wpg="http://schemas.microsoft.com/office/word/2010/wordprocessingGroup" xmlns:wpi="http://schemas.microsoft.com/office/word/2010/wordprocessingInk" xmlns:wne="http://schemas.microsoft.com/office/word/2006/wordml" xmlns:wps="http://schemas.microsoft.com/office/word/2010/wordprocessingShape" mc:Ignorable="w14 w15 w16se w16cid w16 w16cex w16sdtdh w16sdtfl w16du wp14">
   <w:footnote w:type="separator" w:id="-1">
     <w:p>
       <w:r>
@@ -186,9 +253,39 @@
 </w:footnotes>
 </file>
 
+<file path=word/header1.xml><?xml version="1.0" encoding="utf-8"?>
+<w:hdr xmlns:wpc="http://schemas.microsoft.com/office/word/2010/wordprocessingCanvas" xmlns:cx="http://schemas.microsoft.com/office/drawing/2014/chartex" xmlns:cx1="http://schemas.microsoft.com/office/drawing/2015/9/8/chartex" xmlns:cx2="http://schemas.microsoft.com/office/drawing/2015/10/21/chartex" xmlns:cx3="http://schemas.microsoft.com/office/drawing/2016/5/9/chartex" xmlns:cx4="http://schemas.microsoft.com/office/drawing/2016/5/10/chartex" xmlns:cx5="http://schemas.microsoft.com/office/drawing/2016/5/11/chartex" xmlns:cx6="http://schemas.microsoft.com/office/drawing/2016/5/12/chartex" xmlns:cx7="http://schemas.microsoft.com/office/drawing/2016/5/13/chartex" xmlns:cx8="http://schemas.microsoft.com/office/drawing/2016/5/14/chartex" xmlns:mc="http://schemas.openxmlformats.org/markup-compatibility/2006" xmlns:aink="http://schemas.microsoft.com/office/drawing/2016/ink" xmlns:am3d="http://schemas.microsoft.com/office/drawing/2017/model3d" xmlns:o="urn:schemas-microsoft-com:office:office" xmlns:oel="http://schemas.microsoft.com/office/2019/extlst" xmlns:r="http://schemas.openxmlformats.org/officeDocument/2006/relationships" xmlns:m="http://schemas.openxmlformats.org/officeDocument/2006/math" xmlns:v="urn:schemas-microsoft-com:vml" xmlns:wp14="http://schemas.microsoft.com/office/word/2010/wordprocessingDrawing" xmlns:wp="http://schemas.openxmlformats.org/drawingml/2006/wordprocessingDrawing" xmlns:w10="urn:schemas-microsoft-com:office:word" xmlns:w="http://schemas.openxmlformats.org/wordprocessingml/2006/main" xmlns:w14="http://schemas.microsoft.com/office/word/2010/wordml" xmlns:w15="http://schemas.microsoft.com/office/word/2012/wordml" xmlns:w16cex="http://schemas.microsoft.com/office/word/2018/wordml/cex" xmlns:w16cid="http://schemas.microsoft.com/office/word/2016/wordml/cid" xmlns:w16="http://schemas.microsoft.com/office/word/2018/wordml" xmlns:w16du="http://schemas.microsoft.com/office/word/2023/wordml/word16du" xmlns:w16sdtdh="http://schemas.microsoft.com/office/word/2020/wordml/sdtdatahash" xmlns:w16sdtfl="http://schemas.microsoft.com/office/word/2024/wordml/sdtformatlock" xmlns:w16se="http://schemas.microsoft.com/office/word/2015/wordml/symex" xmlns:wpg="http://schemas.microsoft.com/office/word/2010/wordprocessingGroup" xmlns:wpi="http://schemas.microsoft.com/office/word/2010/wordprocessingInk" xmlns:wne="http://schemas.microsoft.com/office/word/2006/wordml" xmlns:wps="http://schemas.microsoft.com/office/word/2010/wordprocessingShape" mc:Ignorable="w14 w15 w16se w16cid w16 w16cex w16sdtdh w16sdtfl w16du wp14">
+  <w:p>
+    <w:pPr>
+      <w:pStyle w:val="Header"/>
+    </w:pPr>
+  </w:p>
+</w:hdr>
+</file>
+
+<file path=word/header2.xml><?xml version="1.0" encoding="utf-8"?>
+<w:hdr xmlns:wpc="http://schemas.microsoft.com/office/word/2010/wordprocessingCanvas" xmlns:cx="http://schemas.microsoft.com/office/drawing/2014/chartex" xmlns:cx1="http://schemas.microsoft.com/office/drawing/2015/9/8/chartex" xmlns:cx2="http://schemas.microsoft.com/office/drawing/2015/10/21/chartex" xmlns:cx3="http://schemas.microsoft.com/office/drawing/2016/5/9/chartex" xmlns:cx4="http://schemas.microsoft.com/office/drawing/2016/5/10/chartex" xmlns:cx5="http://schemas.microsoft.com/office/drawing/2016/5/11/chartex" xmlns:cx6="http://schemas.microsoft.com/office/drawing/2016/5/12/chartex" xmlns:cx7="http://schemas.microsoft.com/office/drawing/2016/5/13/chartex" xmlns:cx8="http://schemas.microsoft.com/office/drawing/2016/5/14/chartex" xmlns:mc="http://schemas.openxmlformats.org/markup-compatibility/2006" xmlns:aink="http://schemas.microsoft.com/office/drawing/2016/ink" xmlns:am3d="http://schemas.microsoft.com/office/drawing/2017/model3d" xmlns:o="urn:schemas-microsoft-com:office:office" xmlns:oel="http://schemas.microsoft.com/office/2019/extlst" xmlns:r="http://schemas.openxmlformats.org/officeDocument/2006/relationships" xmlns:m="http://schemas.openxmlformats.org/officeDocument/2006/math" xmlns:v="urn:schemas-microsoft-com:vml" xmlns:wp14="http://schemas.microsoft.com/office/word/2010/wordprocessingDrawing" xmlns:wp="http://schemas.openxmlformats.org/drawingml/2006/wordprocessingDrawing" xmlns:w10="urn:schemas-microsoft-com:office:word" xmlns:w="http://schemas.openxmlformats.org/wordprocessingml/2006/main" xmlns:w14="http://schemas.microsoft.com/office/word/2010/wordml" xmlns:w15="http://schemas.microsoft.com/office/word/2012/wordml" xmlns:w16cex="http://schemas.microsoft.com/office/word/2018/wordml/cex" xmlns:w16cid="http://schemas.microsoft.com/office/word/2016/wordml/cid" xmlns:w16="http://schemas.microsoft.com/office/word/2018/wordml" xmlns:w16du="http://schemas.microsoft.com/office/word/2023/wordml/word16du" xmlns:w16sdtdh="http://schemas.microsoft.com/office/word/2020/wordml/sdtdatahash" xmlns:w16sdtfl="http://schemas.microsoft.com/office/word/2024/wordml/sdtformatlock" xmlns:w16se="http://schemas.microsoft.com/office/word/2015/wordml/symex" xmlns:wpg="http://schemas.microsoft.com/office/word/2010/wordprocessingGroup" xmlns:wpi="http://schemas.microsoft.com/office/word/2010/wordprocessingInk" xmlns:wne="http://schemas.microsoft.com/office/word/2006/wordml" xmlns:wps="http://schemas.microsoft.com/office/word/2010/wordprocessingShape" mc:Ignorable="w14 w15 w16se w16cid w16 w16cex w16sdtdh w16sdtfl w16du wp14">
+  <w:p>
+    <w:pPr>
+      <w:pStyle w:val="Header"/>
+    </w:pPr>
+  </w:p>
+</w:hdr>
+</file>
+
+<file path=word/header3.xml><?xml version="1.0" encoding="utf-8"?>
+<w:hdr xmlns:wpc="http://schemas.microsoft.com/office/word/2010/wordprocessingCanvas" xmlns:cx="http://schemas.microsoft.com/office/drawing/2014/chartex" xmlns:cx1="http://schemas.microsoft.com/office/drawing/2015/9/8/chartex" xmlns:cx2="http://schemas.microsoft.com/office/drawing/2015/10/21/chartex" xmlns:cx3="http://schemas.microsoft.com/office/drawing/2016/5/9/chartex" xmlns:cx4="http://schemas.microsoft.com/office/drawing/2016/5/10/chartex" xmlns:cx5="http://schemas.microsoft.com/office/drawing/2016/5/11/chartex" xmlns:cx6="http://schemas.microsoft.com/office/drawing/2016/5/12/chartex" xmlns:cx7="http://schemas.microsoft.com/office/drawing/2016/5/13/chartex" xmlns:cx8="http://schemas.microsoft.com/office/drawing/2016/5/14/chartex" xmlns:mc="http://schemas.openxmlformats.org/markup-compatibility/2006" xmlns:aink="http://schemas.microsoft.com/office/drawing/2016/ink" xmlns:am3d="http://schemas.microsoft.com/office/drawing/2017/model3d" xmlns:o="urn:schemas-microsoft-com:office:office" xmlns:oel="http://schemas.microsoft.com/office/2019/extlst" xmlns:r="http://schemas.openxmlformats.org/officeDocument/2006/relationships" xmlns:m="http://schemas.openxmlformats.org/officeDocument/2006/math" xmlns:v="urn:schemas-microsoft-com:vml" xmlns:wp14="http://schemas.microsoft.com/office/word/2010/wordprocessingDrawing" xmlns:wp="http://schemas.openxmlformats.org/drawingml/2006/wordprocessingDrawing" xmlns:w10="urn:schemas-microsoft-com:office:word" xmlns:w="http://schemas.openxmlformats.org/wordprocessingml/2006/main" xmlns:w14="http://schemas.microsoft.com/office/word/2010/wordml" xmlns:w15="http://schemas.microsoft.com/office/word/2012/wordml" xmlns:w16cex="http://schemas.microsoft.com/office/word/2018/wordml/cex" xmlns:w16cid="http://schemas.microsoft.com/office/word/2016/wordml/cid" xmlns:w16="http://schemas.microsoft.com/office/word/2018/wordml" xmlns:w16du="http://schemas.microsoft.com/office/word/2023/wordml/word16du" xmlns:w16sdtdh="http://schemas.microsoft.com/office/word/2020/wordml/sdtdatahash" xmlns:w16sdtfl="http://schemas.microsoft.com/office/word/2024/wordml/sdtformatlock" xmlns:w16se="http://schemas.microsoft.com/office/word/2015/wordml/symex" xmlns:wpg="http://schemas.microsoft.com/office/word/2010/wordprocessingGroup" xmlns:wpi="http://schemas.microsoft.com/office/word/2010/wordprocessingInk" xmlns:wne="http://schemas.microsoft.com/office/word/2006/wordml" xmlns:wps="http://schemas.microsoft.com/office/word/2010/wordprocessingShape" mc:Ignorable="w14 w15 w16se w16cid w16 w16cex w16sdtdh w16sdtfl w16du wp14">
+  <w:p>
+    <w:pPr>
+      <w:pStyle w:val="Header"/>
+    </w:pPr>
+  </w:p>
+</w:hdr>
+</file>
+
 <file path=word/numbering.xml><?xml version="1.0" encoding="utf-8"?>
-<w:numbering xmlns:wpc="http://schemas.microsoft.com/office/word/2010/wordprocessingCanvas" xmlns:mc="http://schemas.openxmlformats.org/markup-compatibility/2006" xmlns:o="urn:schemas-microsoft-com:office:office" xmlns:r="http://schemas.openxmlformats.org/officeDocument/2006/relationships" xmlns:m="http://schemas.openxmlformats.org/officeDocument/2006/math" xmlns:v="urn:schemas-microsoft-com:vml" xmlns:wp14="http://schemas.microsoft.com/office/word/2010/wordprocessingDrawing" xmlns:wp="http://schemas.openxmlformats.org/drawingml/2006/wordprocessingDrawing" xmlns:w10="urn:schemas-microsoft-com:office:word" xmlns:w="http://schemas.openxmlformats.org/wordprocessingml/2006/main" xmlns:w14="http://schemas.microsoft.com/office/word/2010/wordml" xmlns:wpg="http://schemas.microsoft.com/office/word/2010/wordprocessingGroup" xmlns:wpi="http://schemas.microsoft.com/office/word/2010/wordprocessingInk" xmlns:wne="http://schemas.microsoft.com/office/word/2006/wordml" xmlns:wps="http://schemas.microsoft.com/office/word/2010/wordprocessingShape" mc:Ignorable="w14 wp14">
-  <w:abstractNum w:abstractNumId="0">
+<w:numbering xmlns:wpc="http://schemas.microsoft.com/office/word/2010/wordprocessingCanvas" xmlns:cx="http://schemas.microsoft.com/office/drawing/2014/chartex" xmlns:cx1="http://schemas.microsoft.com/office/drawing/2015/9/8/chartex" xmlns:cx2="http://schemas.microsoft.com/office/drawing/2015/10/21/chartex" xmlns:cx3="http://schemas.microsoft.com/office/drawing/2016/5/9/chartex" xmlns:cx4="http://schemas.microsoft.com/office/drawing/2016/5/10/chartex" xmlns:cx5="http://schemas.microsoft.com/office/drawing/2016/5/11/chartex" xmlns:cx6="http://schemas.microsoft.com/office/drawing/2016/5/12/chartex" xmlns:cx7="http://schemas.microsoft.com/office/drawing/2016/5/13/chartex" xmlns:cx8="http://schemas.microsoft.com/office/drawing/2016/5/14/chartex" xmlns:mc="http://schemas.openxmlformats.org/markup-compatibility/2006" xmlns:aink="http://schemas.microsoft.com/office/drawing/2016/ink" xmlns:am3d="http://schemas.microsoft.com/office/drawing/2017/model3d" xmlns:o="urn:schemas-microsoft-com:office:office" xmlns:oel="http://schemas.microsoft.com/office/2019/extlst" xmlns:r="http://schemas.openxmlformats.org/officeDocument/2006/relationships" xmlns:m="http://schemas.openxmlformats.org/officeDocument/2006/math" xmlns:v="urn:schemas-microsoft-com:vml" xmlns:wp14="http://schemas.microsoft.com/office/word/2010/wordprocessingDrawing" xmlns:wp="http://schemas.openxmlformats.org/drawingml/2006/wordprocessingDrawing" xmlns:w10="urn:schemas-microsoft-com:office:word" xmlns:w="http://schemas.openxmlformats.org/wordprocessingml/2006/main" xmlns:w14="http://schemas.microsoft.com/office/word/2010/wordml" xmlns:w15="http://schemas.microsoft.com/office/word/2012/wordml" xmlns:w16cex="http://schemas.microsoft.com/office/word/2018/wordml/cex" xmlns:w16cid="http://schemas.microsoft.com/office/word/2016/wordml/cid" xmlns:w16="http://schemas.microsoft.com/office/word/2018/wordml" xmlns:w16du="http://schemas.microsoft.com/office/word/2023/wordml/word16du" xmlns:w16sdtdh="http://schemas.microsoft.com/office/word/2020/wordml/sdtdatahash" xmlns:w16sdtfl="http://schemas.microsoft.com/office/word/2024/wordml/sdtformatlock" xmlns:w16se="http://schemas.microsoft.com/office/word/2015/wordml/symex" xmlns:wpg="http://schemas.microsoft.com/office/word/2010/wordprocessingGroup" xmlns:wpi="http://schemas.microsoft.com/office/word/2010/wordprocessingInk" xmlns:wne="http://schemas.microsoft.com/office/word/2006/wordml" xmlns:wps="http://schemas.microsoft.com/office/word/2010/wordprocessingShape" mc:Ignorable="w14 w15 w16se w16cid w16 w16cex w16sdtdh w16sdtfl w16du wp14">
+  <w:abstractNum w:abstractNumId="0" w15:restartNumberingAfterBreak="0">
     <w:nsid w:val="5BCE4232"/>
     <w:multiLevelType w:val="hybridMultilevel"/>
     <w:tmpl w:val="C14AE192"/>
@@ -302,14 +399,14 @@
       </w:rPr>
     </w:lvl>
   </w:abstractNum>
-  <w:num w:numId="1">
+  <w:num w:numId="1" w16cid:durableId="101804748">
     <w:abstractNumId w:val="0"/>
   </w:num>
 </w:numbering>
 </file>
 
 <file path=word/styles.xml><?xml version="1.0" encoding="utf-8"?>
-<w:styles xmlns:mc="http://schemas.openxmlformats.org/markup-compatibility/2006" xmlns:r="http://schemas.openxmlformats.org/officeDocument/2006/relationships" xmlns:w="http://schemas.openxmlformats.org/wordprocessingml/2006/main" xmlns:w14="http://schemas.microsoft.com/office/word/2010/wordml" mc:Ignorable="w14">
+<w:styles xmlns:mc="http://schemas.openxmlformats.org/markup-compatibility/2006" xmlns:r="http://schemas.openxmlformats.org/officeDocument/2006/relationships" xmlns:w="http://schemas.openxmlformats.org/wordprocessingml/2006/main" xmlns:w14="http://schemas.microsoft.com/office/word/2010/wordml" xmlns:w15="http://schemas.microsoft.com/office/word/2012/wordml" xmlns:w16cex="http://schemas.microsoft.com/office/word/2018/wordml/cex" xmlns:w16cid="http://schemas.microsoft.com/office/word/2016/wordml/cid" xmlns:w16="http://schemas.microsoft.com/office/word/2018/wordml" xmlns:w16du="http://schemas.microsoft.com/office/word/2023/wordml/word16du" xmlns:w16sdtdh="http://schemas.microsoft.com/office/word/2020/wordml/sdtdatahash" xmlns:w16sdtfl="http://schemas.microsoft.com/office/word/2024/wordml/sdtformatlock" xmlns:w16se="http://schemas.microsoft.com/office/word/2015/wordml/symex" mc:Ignorable="w14 w15 w16se w16cid w16 w16cex w16sdtdh w16sdtfl w16du">
   <w:docDefaults>
     <w:rPrDefault>
       <w:rPr>
@@ -325,680 +422,383 @@
       </w:pPr>
     </w:pPrDefault>
   </w:docDefaults>
-  <w:latentStyles w:defLockedState="0" w:defUIPriority="99" w:defSemiHidden="1" w:defUnhideWhenUsed="1" w:defQFormat="0" w:count="267">
-    <w:lsdException w:name="Normal" w:semiHidden="0" w:uiPriority="0" w:unhideWhenUsed="0" w:qFormat="1"/>
-    <w:lsdException w:name="heading 1" w:semiHidden="0" w:uiPriority="9" w:unhideWhenUsed="0" w:qFormat="1"/>
-    <w:lsdException w:name="heading 2" w:uiPriority="9" w:qFormat="1"/>
-    <w:lsdException w:name="heading 3" w:uiPriority="9" w:qFormat="1"/>
-    <w:lsdException w:name="heading 4" w:uiPriority="9" w:qFormat="1"/>
-    <w:lsdException w:name="heading 5" w:uiPriority="9" w:qFormat="1"/>
-    <w:lsdException w:name="heading 6" w:uiPriority="9" w:qFormat="1"/>
-    <w:lsdException w:name="heading 7" w:uiPriority="9" w:qFormat="1"/>
-    <w:lsdException w:name="heading 8" w:uiPriority="9" w:qFormat="1"/>
-    <w:lsdException w:name="heading 9" w:uiPriority="9" w:qFormat="1"/>
-    <w:lsdException w:name="toc 1" w:uiPriority="39"/>
-    <w:lsdException w:name="toc 2" w:uiPriority="39"/>
-    <w:lsdException w:name="toc 3" w:uiPriority="39"/>
-    <w:lsdException w:name="toc 4" w:uiPriority="39"/>
-    <w:lsdException w:name="toc 5" w:uiPriority="39"/>
-    <w:lsdException w:name="toc 6" w:uiPriority="39"/>
-    <w:lsdException w:name="toc 7" w:uiPriority="39"/>
-    <w:lsdException w:name="toc 8" w:uiPriority="39"/>
-    <w:lsdException w:name="toc 9" w:uiPriority="39"/>
-    <w:lsdException w:name="caption" w:uiPriority="35" w:qFormat="1"/>
-    <w:lsdException w:name="Title" w:semiHidden="0" w:uiPriority="10" w:unhideWhenUsed="0" w:qFormat="1"/>
-    <w:lsdException w:name="Default Paragraph Font" w:uiPriority="1"/>
-    <w:lsdException w:name="Subtitle" w:semiHidden="0" w:uiPriority="11" w:unhideWhenUsed="0" w:qFormat="1"/>
-    <w:lsdException w:name="Strong" w:semiHidden="0" w:uiPriority="22" w:unhideWhenUsed="0" w:qFormat="1"/>
-    <w:lsdException w:name="Emphasis" w:semiHidden="0" w:uiPriority="20" w:unhideWhenUsed="0" w:qFormat="1"/>
-    <w:lsdException w:name="Table Grid" w:semiHidden="0" w:uiPriority="59" w:unhideWhenUsed="0"/>
-    <w:lsdException w:name="Placeholder Text" w:unhideWhenUsed="0"/>
-    <w:lsdException w:name="No Spacing" w:semiHidden="0" w:uiPriority="1" w:unhideWhenUsed="0" w:qFormat="1"/>
-    <w:lsdException w:name="Light Shading" w:semiHidden="0" w:uiPriority="60" w:unhideWhenUsed="0"/>
-    <w:lsdException w:name="Light List" w:semiHidden="0" w:uiPriority="61" w:unhideWhenUsed="0"/>
-    <w:lsdException w:name="Light Grid" w:semiHidden="0" w:uiPriority="62" w:unhideWhenUsed="0"/>
-    <w:lsdException w:name="Medium Shading 1" w:semiHidden="0" w:uiPriority="63" w:unhideWhenUsed="0"/>
-    <w:lsdException w:name="Medium Shading 2" w:semiHidden="0" w:uiPriority="64" w:unhideWhenUsed="0"/>
-    <w:lsdException w:name="Medium List 1" w:semiHidden="0" w:uiPriority="65" w:unhideWhenUsed="0"/>
-    <w:lsdException w:name="Medium List 2" w:semiHidden="0" w:uiPriority="66" w:unhideWhenUsed="0"/>
-    <w:lsdException w:name="Medium Grid 1" w:semiHidden="0" w:uiPriority="67" w:unhideWhenUsed="0"/>
-    <w:lsdException w:name="Medium Grid 2" w:semiHidden="0" w:uiPriority="68" w:unhideWhenUsed="0"/>
-    <w:lsdException w:name="Medium Grid 3" w:semiHidden="0" w:uiPriority="69" w:unhideWhenUsed="0"/>
-    <w:lsdException w:name="Dark List" w:semiHidden="0" w:uiPriority="70" w:unhideWhenUsed="0"/>
-    <w:lsdException w:name="Colorful Shading" w:semiHidden="0" w:uiPriority="71" w:unhideWhenUsed="0"/>
-    <w:lsdException w:name="Colorful List" w:semiHidden="0" w:uiPriority="72" w:unhideWhenUsed="0"/>
-    <w:lsdException w:name="Colorful Grid" w:semiHidden="0" w:uiPriority="73" w:unhideWhenUsed="0"/>
-    <w:lsdException w:name="Light Shading Accent 1" w:semiHidden="0" w:uiPriority="60" w:unhideWhenUsed="0"/>
-    <w:lsdException w:name="Light List Accent 1" w:semiHidden="0" w:uiPriority="61" w:unhideWhenUsed="0"/>
-    <w:lsdException w:name="Light Grid Accent 1" w:semiHidden="0" w:uiPriority="62" w:unhideWhenUsed="0"/>
-    <w:lsdException w:name="Medium Shading 1 Accent 1" w:semiHidden="0" w:uiPriority="63" w:unhideWhenUsed="0"/>
-    <w:lsdException w:name="Medium Shading 2 Accent 1" w:semiHidden="0" w:uiPriority="64" w:unhideWhenUsed="0"/>
-    <w:lsdException w:name="Medium List 1 Accent 1" w:semiHidden="0" w:uiPriority="65" w:unhideWhenUsed="0"/>
-    <w:lsdException w:name="Revision" w:unhideWhenUsed="0"/>
-    <w:lsdException w:name="List Paragraph" w:semiHidden="0" w:uiPriority="34" w:unhideWhenUsed="0" w:qFormat="1"/>
-    <w:lsdException w:name="Quote" w:semiHidden="0" w:uiPriority="29" w:unhideWhenUsed="0" w:qFormat="1"/>
-    <w:lsdException w:name="Intense Quote" w:semiHidden="0" w:uiPriority="30" w:unhideWhenUsed="0" w:qFormat="1"/>
-    <w:lsdException w:name="Medium List 2 Accent 1" w:semiHidden="0" w:uiPriority="66" w:unhideWhenUsed="0"/>
-    <w:lsdException w:name="Medium Grid 1 Accent 1" w:semiHidden="0" w:uiPriority="67" w:unhideWhenUsed="0"/>
-    <w:lsdException w:name="Medium Grid 2 Accent 1" w:semiHidden="0" w:uiPriority="68" w:unhideWhenUsed="0"/>
-    <w:lsdException w:name="Medium Grid 3 Accent 1" w:semiHidden="0" w:uiPriority="69" w:unhideWhenUsed="0"/>
-    <w:lsdException w:name="Dark List Accent 1" w:semiHidden="0" w:uiPriority="70" w:unhideWhenUsed="0"/>
-    <w:lsdException w:name="Colorful Shading Accent 1" w:semiHidden="0" w:uiPriority="71" w:unhideWhenUsed="0"/>
-    <w:lsdException w:name="Colorful List Accent 1" w:semiHidden="0" w:uiPriority="72" w:unhideWhenUsed="0"/>
-    <w:lsdException w:name="Colorful Grid Accent 1" w:semiHidden="0" w:uiPriority="73" w:unhideWhenUsed="0"/>
-    <w:lsdException w:name="Light Shading Accent 2" w:semiHidden="0" w:uiPriority="60" w:unhideWhenUsed="0"/>
-    <w:lsdException w:name="Light List Accent 2" w:semiHidden="0" w:uiPriority="61" w:unhideWhenUsed="0"/>
-    <w:lsdException w:name="Light Grid Accent 2" w:semiHidden="0" w:uiPriority="62" w:unhideWhenUsed="0"/>
-    <w:lsdException w:name="Medium Shading 1 Accent 2" w:semiHidden="0" w:uiPriority="63" w:unhideWhenUsed="0"/>
-    <w:lsdException w:name="Medium Shading 2 Accent 2" w:semiHidden="0" w:uiPriority="64" w:unhideWhenUsed="0"/>
-    <w:lsdException w:name="Medium List 1 Accent 2" w:semiHidden="0" w:uiPriority="65" w:unhideWhenUsed="0"/>
-    <w:lsdException w:name="Medium List 2 Accent 2" w:semiHidden="0" w:uiPriority="66" w:unhideWhenUsed="0"/>
-    <w:lsdException w:name="Medium Grid 1 Accent 2" w:semiHidden="0" w:uiPriority="67" w:unhideWhenUsed="0"/>
-    <w:lsdException w:name="Medium Grid 2 Accent 2" w:semiHidden="0" w:uiPriority="68" w:unhideWhenUsed="0"/>
-    <w:lsdException w:name="Medium Grid 3 Accent 2" w:semiHidden="0" w:uiPriority="69" w:unhideWhenUsed="0"/>
-    <w:lsdException w:name="Dark List Accent 2" w:semiHidden="0" w:uiPriority="70" w:unhideWhenUsed="0"/>
-    <w:lsdException w:name="Colorful Shading Accent 2" w:semiHidden="0" w:uiPriority="71" w:unhideWhenUsed="0"/>
-    <w:lsdException w:name="Colorful List Accent 2" w:semiHidden="0" w:uiPriority="72" w:unhideWhenUsed="0"/>
-    <w:lsdException w:name="Colorful Grid Accent 2" w:semiHidden="0" w:uiPriority="73" w:unhideWhenUsed="0"/>
-    <w:lsdException w:name="Light Shading Accent 3" w:semiHidden="0" w:uiPriority="60" w:unhideWhenUsed="0"/>
-    <w:lsdException w:name="Light List Accent 3" w:semiHidden="0" w:uiPriority="61" w:unhideWhenUsed="0"/>
-    <w:lsdException w:name="Light Grid Accent 3" w:semiHidden="0" w:uiPriority="62" w:unhideWhenUsed="0"/>
-    <w:lsdException w:name="Medium Shading 1 Accent 3" w:semiHidden="0" w:uiPriority="63" w:unhideWhenUsed="0"/>
-    <w:lsdException w:name="Medium Shading 2 Accent 3" w:semiHidden="0" w:uiPriority="64" w:unhideWhenUsed="0"/>
-    <w:lsdException w:name="Medium List 1 Accent 3" w:semiHidden="0" w:uiPriority="65" w:unhideWhenUsed="0"/>
-    <w:lsdException w:name="Medium List 2 Accent 3" w:semiHidden="0" w:uiPriority="66" w:unhideWhenUsed="0"/>
-    <w:lsdException w:name="Medium Grid 1 Accent 3" w:semiHidden="0" w:uiPriority="67" w:unhideWhenUsed="0"/>
-    <w:lsdException w:name="Medium Grid 2 Accent 3" w:semiHidden="0" w:uiPriority="68" w:unhideWhenUsed="0"/>
-    <w:lsdException w:name="Medium Grid 3 Accent 3" w:semiHidden="0" w:uiPriority="69" w:unhideWhenUsed="0"/>
-    <w:lsdException w:name="Dark List Accent 3" w:semiHidden="0" w:uiPriority="70" w:unhideWhenUsed="0"/>
-    <w:lsdException w:name="Colorful Shading Accent 3" w:semiHidden="0" w:uiPriority="71" w:unhideWhenUsed="0"/>
-    <w:lsdException w:name="Colorful List Accent 3" w:semiHidden="0" w:uiPriority="72" w:unhideWhenUsed="0"/>
-    <w:lsdException w:name="Colorful Grid Accent 3" w:semiHidden="0" w:uiPriority="73" w:unhideWhenUsed="0"/>
-    <w:lsdException w:name="Light Shading Accent 4" w:semiHidden="0" w:uiPriority="60" w:unhideWhenUsed="0"/>
-    <w:lsdException w:name="Light List Accent 4" w:semiHidden="0" w:uiPriority="61" w:unhideWhenUsed="0"/>
-    <w:lsdException w:name="Light Grid Accent 4" w:semiHidden="0" w:uiPriority="62" w:unhideWhenUsed="0"/>
-    <w:lsdException w:name="Medium Shading 1 Accent 4" w:semiHidden="0" w:uiPriority="63" w:unhideWhenUsed="0"/>
-    <w:lsdException w:name="Medium Shading 2 Accent 4" w:semiHidden="0" w:uiPriority="64" w:unhideWhenUsed="0"/>
-    <w:lsdException w:name="Medium List 1 Accent 4" w:semiHidden="0" w:uiPriority="65" w:unhideWhenUsed="0"/>
-    <w:lsdException w:name="Medium List 2 Accent 4" w:semiHidden="0" w:uiPriority="66" w:unhideWhenUsed="0"/>
-    <w:lsdException w:name="Medium Grid 1 Accent 4" w:semiHidden="0" w:uiPriority="67" w:unhideWhenUsed="0"/>
-    <w:lsdException w:name="Medium Grid 2 Accent 4" w:semiHidden="0" w:uiPriority="68" w:unhideWhenUsed="0"/>
-    <w:lsdException w:name="Medium Grid 3 Accent 4" w:semiHidden="0" w:uiPriority="69" w:unhideWhenUsed="0"/>
-    <w:lsdException w:name="Dark List Accent 4" w:semiHidden="0" w:uiPriority="70" w:unhideWhenUsed="0"/>
-    <w:lsdException w:name="Colorful Shading Accent 4" w:semiHidden="0" w:uiPriority="71" w:unhideWhenUsed="0"/>
-    <w:lsdException w:name="Colorful List Accent 4" w:semiHidden="0" w:uiPriority="72" w:unhideWhenUsed="0"/>
-    <w:lsdException w:name="Colorful Grid Accent 4" w:semiHidden="0" w:uiPriority="73" w:unhideWhenUsed="0"/>
-    <w:lsdException w:name="Light Shading Accent 5" w:semiHidden="0" w:uiPriority="60" w:unhideWhenUsed="0"/>
-    <w:lsdException w:name="Light List Accent 5" w:semiHidden="0" w:uiPriority="61" w:unhideWhenUsed="0"/>
-    <w:lsdException w:name="Light Grid Accent 5" w:semiHidden="0" w:uiPriority="62" w:unhideWhenUsed="0"/>
-    <w:lsdException w:name="Medium Shading 1 Accent 5" w:semiHidden="0" w:uiPriority="63" w:unhideWhenUsed="0"/>
-    <w:lsdException w:name="Medium Shading 2 Accent 5" w:semiHidden="0" w:uiPriority="64" w:unhideWhenUsed="0"/>
-    <w:lsdException w:name="Medium List 1 Accent 5" w:semiHidden="0" w:uiPriority="65" w:unhideWhenUsed="0"/>
-    <w:lsdException w:name="Medium List 2 Accent 5" w:semiHidden="0" w:uiPriority="66" w:unhideWhenUsed="0"/>
-    <w:lsdException w:name="Medium Grid 1 Accent 5" w:semiHidden="0" w:uiPriority="67" w:unhideWhenUsed="0"/>
-    <w:lsdException w:name="Medium Grid 2 Accent 5" w:semiHidden="0" w:uiPriority="68" w:unhideWhenUsed="0"/>
-    <w:lsdException w:name="Medium Grid 3 Accent 5" w:semiHidden="0" w:uiPriority="69" w:unhideWhenUsed="0"/>
-    <w:lsdException w:name="Dark List Accent 5" w:semiHidden="0" w:uiPriority="70" w:unhideWhenUsed="0"/>
-    <w:lsdException w:name="Colorful Shading Accent 5" w:semiHidden="0" w:uiPriority="71" w:unhideWhenUsed="0"/>
-    <w:lsdException w:name="Colorful List Accent 5" w:semiHidden="0" w:uiPriority="72" w:unhideWhenUsed="0"/>
-    <w:lsdException w:name="Colorful Grid Accent 5" w:semiHidden="0" w:uiPriority="73" w:unhideWhenUsed="0"/>
-    <w:lsdException w:name="Light Shading Accent 6" w:semiHidden="0" w:uiPriority="60" w:unhideWhenUsed="0"/>
-    <w:lsdException w:name="Light List Accent 6" w:semiHidden="0" w:uiPriority="61" w:unhideWhenUsed="0"/>
-    <w:lsdException w:name="Light Grid Accent 6" w:semiHidden="0" w:uiPriority="62" w:unhideWhenUsed="0"/>
-    <w:lsdException w:name="Medium Shading 1 Accent 6" w:semiHidden="0" w:uiPriority="63" w:unhideWhenUsed="0"/>
-    <w:lsdException w:name="Medium Shading 2 Accent 6" w:semiHidden="0" w:uiPriority="64" w:unhideWhenUsed="0"/>
-    <w:lsdException w:name="Medium List 1 Accent 6" w:semiHidden="0" w:uiPriority="65" w:unhideWhenUsed="0"/>
-    <w:lsdException w:name="Medium List 2 Accent 6" w:semiHidden="0" w:uiPriority="66" w:unhideWhenUsed="0"/>
-    <w:lsdException w:name="Medium Grid 1 Accent 6" w:semiHidden="0" w:uiPriority="67" w:unhideWhenUsed="0"/>
-    <w:lsdException w:name="Medium Grid 2 Accent 6" w:semiHidden="0" w:uiPriority="68" w:unhideWhenUsed="0"/>
-    <w:lsdException w:name="Medium Grid 3 Accent 6" w:semiHidden="0" w:uiPriority="69" w:unhideWhenUsed="0"/>
-    <w:lsdException w:name="Dark List Accent 6" w:semiHidden="0" w:uiPriority="70" w:unhideWhenUsed="0"/>
-    <w:lsdException w:name="Colorful Shading Accent 6" w:semiHidden="0" w:uiPriority="71" w:unhideWhenUsed="0"/>
-    <w:lsdException w:name="Colorful List Accent 6" w:semiHidden="0" w:uiPriority="72" w:unhideWhenUsed="0"/>
-    <w:lsdException w:name="Colorful Grid Accent 6" w:semiHidden="0" w:uiPriority="73" w:unhideWhenUsed="0"/>
-    <w:lsdException w:name="Subtle Emphasis" w:semiHidden="0" w:uiPriority="19" w:unhideWhenUsed="0" w:qFormat="1"/>
-    <w:lsdException w:name="Intense Emphasis" w:semiHidden="0" w:uiPriority="21" w:unhideWhenUsed="0" w:qFormat="1"/>
-    <w:lsdException w:name="Subtle Reference" w:semiHidden="0" w:uiPriority="31" w:unhideWhenUsed="0" w:qFormat="1"/>
-    <w:lsdException w:name="Intense Reference" w:semiHidden="0" w:uiPriority="32" w:unhideWhenUsed="0" w:qFormat="1"/>
-    <w:lsdException w:name="Book Title" w:semiHidden="0" w:uiPriority="33" w:unhideWhenUsed="0" w:qFormat="1"/>
-    <w:lsdException w:name="Bibliography" w:uiPriority="37"/>
-    <w:lsdException w:name="TOC Heading" w:uiPriority="39" w:qFormat="1"/>
-  </w:latentStyles>
-  <w:style w:type="paragraph" w:default="1" w:styleId="Normal">
-    <w:name w:val="Normal"/>
-    <w:qFormat/>
-    <w:rsid w:val="00682500"/>
-    <w:rPr>
-      <w:sz w:val="28"/>
-    </w:rPr>
-  </w:style>
-  <w:style w:type="paragraph" w:styleId="Heading1">
-    <w:name w:val="heading 1"/>
-    <w:basedOn w:val="Normal"/>
-    <w:next w:val="Normal"/>
-    <w:link w:val="Heading1Char"/>
-    <w:uiPriority w:val="9"/>
-    <w:qFormat/>
-    <w:rsid w:val="00AF6CC8"/>
-    <w:pPr>
-      <w:keepNext/>
-      <w:keepLines/>
-      <w:pBdr>
-        <w:bottom w:val="single" w:sz="4" w:space="1" w:color="auto"/>
-      </w:pBdr>
-      <w:spacing w:before="240" w:after="240"/>
-      <w:outlineLvl w:val="0"/>
-    </w:pPr>
-    <w:rPr>
-      <w:rFonts w:eastAsiaTheme="majorEastAsia" w:cstheme="minorHAnsi"/>
-      <w:b/>
-      <w:bCs/>
-      <w:color w:val="365F91" w:themeColor="accent1" w:themeShade="BF"/>
-      <w:sz w:val="40"/>
-      <w:szCs w:val="40"/>
-    </w:rPr>
-  </w:style>
-  <w:style w:type="paragraph" w:styleId="Heading2">
-    <w:name w:val="heading 2"/>
-    <w:basedOn w:val="Normal"/>
-    <w:next w:val="Normal"/>
-    <w:link w:val="Heading2Char"/>
-    <w:uiPriority w:val="9"/>
-    <w:unhideWhenUsed/>
-    <w:qFormat/>
-    <w:rsid w:val="00B467BA"/>
-    <w:pPr>
-      <w:keepNext/>
-      <w:keepLines/>
-      <w:spacing w:before="240" w:after="120"/>
-      <w:outlineLvl w:val="1"/>
-    </w:pPr>
-    <w:rPr>
-      <w:rFonts w:eastAsiaTheme="majorEastAsia" w:cstheme="minorHAnsi"/>
-      <w:b/>
-      <w:bCs/>
-      <w:color w:val="4F81BD" w:themeColor="accent1"/>
-      <w:sz w:val="36"/>
-      <w:szCs w:val="36"/>
-    </w:rPr>
-  </w:style>
-  <w:style w:type="paragraph" w:styleId="Heading3">
-    <w:name w:val="heading 3"/>
-    <w:basedOn w:val="Normal"/>
-    <w:next w:val="Normal"/>
-    <w:link w:val="Heading3Char"/>
-    <w:uiPriority w:val="9"/>
-    <w:unhideWhenUsed/>
-    <w:qFormat/>
-    <w:rsid w:val="001716AF"/>
-    <w:pPr>
-      <w:keepNext/>
-      <w:keepLines/>
-      <w:spacing w:before="120" w:after="0"/>
-      <w:outlineLvl w:val="2"/>
-    </w:pPr>
-    <w:rPr>
-      <w:rFonts w:ascii="Arial" w:eastAsiaTheme="majorEastAsia" w:hAnsi="Arial" w:cstheme="majorBidi"/>
-      <w:color w:val="243F60" w:themeColor="accent1" w:themeShade="7F"/>
-      <w:sz w:val="32"/>
-      <w:szCs w:val="24"/>
-    </w:rPr>
-  </w:style>
-  <w:style w:type="paragraph" w:styleId="Heading4">
-    <w:name w:val="heading 4"/>
-    <w:basedOn w:val="Normal"/>
-    <w:next w:val="Normal"/>
-    <w:link w:val="Heading4Char"/>
-    <w:uiPriority w:val="9"/>
-    <w:unhideWhenUsed/>
-    <w:qFormat/>
-    <w:rsid w:val="001716AF"/>
-    <w:pPr>
-      <w:keepNext/>
-      <w:keepLines/>
-      <w:spacing w:after="0"/>
-      <w:outlineLvl w:val="3"/>
-    </w:pPr>
-    <w:rPr>
-      <w:rFonts w:ascii="Arial" w:eastAsiaTheme="majorEastAsia" w:hAnsi="Arial" w:cs="Arial"/>
-      <w:bCs/>
-      <w:iCs/>
-    </w:rPr>
-  </w:style>
-  <w:style w:type="character" w:default="1" w:styleId="DefaultParagraphFont">
-    <w:name w:val="Default Paragraph Font"/>
-    <w:uiPriority w:val="1"/>
-    <w:semiHidden/>
-    <w:unhideWhenUsed/>
-  </w:style>
-  <w:style w:type="table" w:default="1" w:styleId="TableNormal">
-    <w:name w:val="Normal Table"/>
-    <w:uiPriority w:val="99"/>
-    <w:semiHidden/>
-    <w:unhideWhenUsed/>
-    <w:tblPr>
-      <w:tblInd w:w="0" w:type="dxa"/>
-      <w:tblCellMar>
-        <w:top w:w="0" w:type="dxa"/>
-        <w:left w:w="108" w:type="dxa"/>
-        <w:bottom w:w="0" w:type="dxa"/>
-        <w:right w:w="108" w:type="dxa"/>
-      </w:tblCellMar>
-    </w:tblPr>
-  </w:style>
-  <w:style w:type="numbering" w:default="1" w:styleId="NoList">
-    <w:name w:val="No List"/>
-    <w:uiPriority w:val="99"/>
-    <w:semiHidden/>
-    <w:unhideWhenUsed/>
-  </w:style>
-  <w:style w:type="paragraph" w:styleId="Header">
-    <w:name w:val="header"/>
-    <w:basedOn w:val="Normal"/>
-    <w:link w:val="HeaderChar"/>
-    <w:uiPriority w:val="99"/>
-    <w:unhideWhenUsed/>
-    <w:rsid w:val="00037B15"/>
-    <w:pPr>
-      <w:tabs>
-        <w:tab w:val="center" w:pos="4513"/>
-        <w:tab w:val="right" w:pos="9026"/>
-      </w:tabs>
-      <w:spacing w:after="0" w:line="240" w:lineRule="auto"/>
-    </w:pPr>
-  </w:style>
-  <w:style w:type="character" w:customStyle="1" w:styleId="HeaderChar">
-    <w:name w:val="Header Char"/>
-    <w:basedOn w:val="DefaultParagraphFont"/>
-    <w:link w:val="Header"/>
-    <w:uiPriority w:val="99"/>
-    <w:rsid w:val="00E043FD"/>
-    <w:rPr>
-      <w:sz w:val="28"/>
-    </w:rPr>
-  </w:style>
-  <w:style w:type="paragraph" w:styleId="Footer">
-    <w:name w:val="footer"/>
-    <w:basedOn w:val="Normal"/>
-    <w:link w:val="FooterChar"/>
-    <w:uiPriority w:val="99"/>
-    <w:unhideWhenUsed/>
-    <w:rsid w:val="00037B15"/>
-    <w:pPr>
-      <w:tabs>
-        <w:tab w:val="center" w:pos="4513"/>
-        <w:tab w:val="right" w:pos="9026"/>
-      </w:tabs>
-      <w:spacing w:after="0" w:line="240" w:lineRule="auto"/>
-    </w:pPr>
-  </w:style>
-  <w:style w:type="character" w:customStyle="1" w:styleId="FooterChar">
-    <w:name w:val="Footer Char"/>
-    <w:basedOn w:val="DefaultParagraphFont"/>
-    <w:link w:val="Footer"/>
-    <w:uiPriority w:val="99"/>
-    <w:rsid w:val="00E043FD"/>
-    <w:rPr>
-      <w:sz w:val="28"/>
-    </w:rPr>
-  </w:style>
-  <w:style w:type="paragraph" w:customStyle="1" w:styleId="3CBD5A742C28424DA5172AD252E32316">
-    <w:name w:val="3CBD5A742C28424DA5172AD252E32316"/>
-    <w:rsid w:val="00E043FD"/>
-    <w:rPr>
-      <w:rFonts w:eastAsiaTheme="minorEastAsia"/>
-      <w:lang w:val="en-US" w:eastAsia="ja-JP"/>
-    </w:rPr>
-  </w:style>
-  <w:style w:type="paragraph" w:styleId="BalloonText">
-    <w:name w:val="Balloon Text"/>
-    <w:basedOn w:val="Normal"/>
-    <w:link w:val="BalloonTextChar"/>
-    <w:uiPriority w:val="99"/>
-    <w:semiHidden/>
-    <w:unhideWhenUsed/>
-    <w:rsid w:val="00E043FD"/>
-    <w:pPr>
-      <w:spacing w:after="0" w:line="240" w:lineRule="auto"/>
-    </w:pPr>
-    <w:rPr>
-      <w:rFonts w:ascii="Tahoma" w:hAnsi="Tahoma" w:cs="Tahoma"/>
-      <w:sz w:val="16"/>
-      <w:szCs w:val="16"/>
-    </w:rPr>
-  </w:style>
-  <w:style w:type="character" w:customStyle="1" w:styleId="BalloonTextChar">
-    <w:name w:val="Balloon Text Char"/>
-    <w:basedOn w:val="DefaultParagraphFont"/>
-    <w:link w:val="BalloonText"/>
-    <w:uiPriority w:val="99"/>
-    <w:semiHidden/>
-    <w:rsid w:val="00E043FD"/>
-    <w:rPr>
-      <w:rFonts w:ascii="Tahoma" w:hAnsi="Tahoma" w:cs="Tahoma"/>
-      <w:sz w:val="16"/>
-      <w:szCs w:val="16"/>
-    </w:rPr>
-  </w:style>
-  <w:style w:type="paragraph" w:styleId="Title">
-    <w:name w:val="Title"/>
-    <w:basedOn w:val="Normal"/>
-    <w:next w:val="Normal"/>
-    <w:link w:val="TitleChar"/>
-    <w:uiPriority w:val="10"/>
-    <w:qFormat/>
-    <w:rsid w:val="00461742"/>
-    <w:pPr>
-      <w:pBdr>
-        <w:bottom w:val="single" w:sz="8" w:space="4" w:color="4F81BD" w:themeColor="accent1"/>
-      </w:pBdr>
-      <w:spacing w:after="300" w:line="240" w:lineRule="auto"/>
-      <w:contextualSpacing/>
-    </w:pPr>
-    <w:rPr>
-      <w:rFonts w:asciiTheme="majorHAnsi" w:eastAsiaTheme="majorEastAsia" w:hAnsiTheme="majorHAnsi" w:cstheme="majorBidi"/>
-      <w:color w:val="17365D" w:themeColor="text2" w:themeShade="BF"/>
-      <w:spacing w:val="5"/>
-      <w:kern w:val="28"/>
-      <w:sz w:val="52"/>
-      <w:szCs w:val="52"/>
-    </w:rPr>
-  </w:style>
-  <w:style w:type="character" w:customStyle="1" w:styleId="TitleChar">
-    <w:name w:val="Title Char"/>
-    <w:basedOn w:val="DefaultParagraphFont"/>
-    <w:link w:val="Title"/>
-    <w:uiPriority w:val="10"/>
-    <w:rsid w:val="00461742"/>
-    <w:rPr>
-      <w:rFonts w:asciiTheme="majorHAnsi" w:eastAsiaTheme="majorEastAsia" w:hAnsiTheme="majorHAnsi" w:cstheme="majorBidi"/>
-      <w:color w:val="17365D" w:themeColor="text2" w:themeShade="BF"/>
-      <w:spacing w:val="5"/>
-      <w:kern w:val="28"/>
-      <w:sz w:val="52"/>
-      <w:szCs w:val="52"/>
-    </w:rPr>
-  </w:style>
-  <w:style w:type="character" w:customStyle="1" w:styleId="Heading1Char">
-    <w:name w:val="Heading 1 Char"/>
-    <w:basedOn w:val="DefaultParagraphFont"/>
-    <w:link w:val="Heading1"/>
-    <w:uiPriority w:val="9"/>
-    <w:rsid w:val="00AF6CC8"/>
-    <w:rPr>
-      <w:rFonts w:eastAsiaTheme="majorEastAsia" w:cstheme="minorHAnsi"/>
-      <w:b/>
-      <w:bCs/>
-      <w:color w:val="365F91" w:themeColor="accent1" w:themeShade="BF"/>
-      <w:sz w:val="40"/>
-      <w:szCs w:val="40"/>
-    </w:rPr>
-  </w:style>
-  <w:style w:type="character" w:customStyle="1" w:styleId="Heading2Char">
-    <w:name w:val="Heading 2 Char"/>
-    <w:basedOn w:val="DefaultParagraphFont"/>
-    <w:link w:val="Heading2"/>
-    <w:uiPriority w:val="9"/>
-    <w:rsid w:val="00B467BA"/>
-    <w:rPr>
-      <w:rFonts w:eastAsiaTheme="majorEastAsia" w:cstheme="minorHAnsi"/>
-      <w:b/>
-      <w:bCs/>
-      <w:color w:val="4F81BD" w:themeColor="accent1"/>
-      <w:sz w:val="36"/>
-      <w:szCs w:val="36"/>
-    </w:rPr>
-  </w:style>
-  <w:style w:type="paragraph" w:styleId="ListParagraph">
-    <w:name w:val="List Paragraph"/>
-    <w:basedOn w:val="Normal"/>
-    <w:link w:val="ListParagraphChar"/>
-    <w:uiPriority w:val="34"/>
-    <w:qFormat/>
-    <w:rsid w:val="002E72C0"/>
-    <w:pPr>
-      <w:numPr>
-        <w:numId w:val="1"/>
-      </w:numPr>
-      <w:spacing w:after="120"/>
-      <w:contextualSpacing/>
-    </w:pPr>
-  </w:style>
-  <w:style w:type="character" w:customStyle="1" w:styleId="Heading3Char">
-    <w:name w:val="Heading 3 Char"/>
-    <w:basedOn w:val="DefaultParagraphFont"/>
-    <w:link w:val="Heading3"/>
-    <w:uiPriority w:val="9"/>
-    <w:rsid w:val="001716AF"/>
-    <w:rPr>
-      <w:rFonts w:ascii="Arial" w:eastAsiaTheme="majorEastAsia" w:hAnsi="Arial" w:cstheme="majorBidi"/>
-      <w:color w:val="243F60" w:themeColor="accent1" w:themeShade="7F"/>
-      <w:sz w:val="32"/>
-      <w:szCs w:val="24"/>
-    </w:rPr>
-  </w:style>
-  <w:style w:type="character" w:customStyle="1" w:styleId="Heading4Char">
-    <w:name w:val="Heading 4 Char"/>
-    <w:basedOn w:val="DefaultParagraphFont"/>
-    <w:link w:val="Heading4"/>
-    <w:uiPriority w:val="9"/>
-    <w:rsid w:val="001716AF"/>
-    <w:rPr>
-      <w:rFonts w:ascii="Arial" w:eastAsiaTheme="majorEastAsia" w:hAnsi="Arial" w:cs="Arial"/>
-      <w:bCs/>
-      <w:iCs/>
-      <w:sz w:val="28"/>
-    </w:rPr>
-  </w:style>
-  <w:style w:type="paragraph" w:styleId="NoSpacing">
-    <w:name w:val="No Spacing"/>
-    <w:uiPriority w:val="1"/>
-    <w:qFormat/>
-    <w:rsid w:val="00037B15"/>
-    <w:pPr>
-      <w:spacing w:after="0" w:line="240" w:lineRule="auto"/>
-    </w:pPr>
-    <w:rPr>
-      <w:sz w:val="28"/>
-    </w:rPr>
-  </w:style>
-  <w:style w:type="paragraph" w:styleId="Revision">
-    <w:name w:val="Revision"/>
-    <w:hidden/>
-    <w:uiPriority w:val="99"/>
-    <w:semiHidden/>
-    <w:rsid w:val="00037B15"/>
-    <w:pPr>
-      <w:spacing w:after="0" w:line="240" w:lineRule="auto"/>
-    </w:pPr>
-  </w:style>
-  <w:style w:type="paragraph" w:customStyle="1" w:styleId="Bulleted">
-    <w:name w:val="Bulleted"/>
-    <w:basedOn w:val="ListParagraph"/>
-    <w:link w:val="BulletedChar"/>
-    <w:qFormat/>
-    <w:rsid w:val="006E24A1"/>
-    <w:pPr>
-      <w:spacing w:after="0"/>
-    </w:pPr>
-  </w:style>
-  <w:style w:type="character" w:customStyle="1" w:styleId="ListParagraphChar">
-    <w:name w:val="List Paragraph Char"/>
-    <w:basedOn w:val="DefaultParagraphFont"/>
-    <w:link w:val="ListParagraph"/>
-    <w:uiPriority w:val="34"/>
-    <w:rsid w:val="006E24A1"/>
-    <w:rPr>
-      <w:sz w:val="28"/>
-    </w:rPr>
-  </w:style>
-  <w:style w:type="character" w:customStyle="1" w:styleId="BulletedChar">
-    <w:name w:val="Bulleted Char"/>
-    <w:basedOn w:val="ListParagraphChar"/>
-    <w:link w:val="Bulleted"/>
-    <w:rsid w:val="006E24A1"/>
-    <w:rPr>
-      <w:sz w:val="28"/>
-    </w:rPr>
-  </w:style>
-</w:styles>
-</file>
-
-<file path=word/stylesWithEffects.xml><?xml version="1.0" encoding="utf-8"?>
-<w:styles xmlns:wpc="http://schemas.microsoft.com/office/word/2010/wordprocessingCanvas" xmlns:mc="http://schemas.openxmlformats.org/markup-compatibility/2006" xmlns:o="urn:schemas-microsoft-com:office:office" xmlns:r="http://schemas.openxmlformats.org/officeDocument/2006/relationships" xmlns:m="http://schemas.openxmlformats.org/officeDocument/2006/math" xmlns:v="urn:schemas-microsoft-com:vml" xmlns:wp14="http://schemas.microsoft.com/office/word/2010/wordprocessingDrawing" xmlns:wp="http://schemas.openxmlformats.org/drawingml/2006/wordprocessingDrawing" xmlns:w10="urn:schemas-microsoft-com:office:word" xmlns:w="http://schemas.openxmlformats.org/wordprocessingml/2006/main" xmlns:w14="http://schemas.microsoft.com/office/word/2010/wordml" xmlns:wpg="http://schemas.microsoft.com/office/word/2010/wordprocessingGroup" xmlns:wpi="http://schemas.microsoft.com/office/word/2010/wordprocessingInk" xmlns:wne="http://schemas.microsoft.com/office/word/2006/wordml" xmlns:wps="http://schemas.microsoft.com/office/word/2010/wordprocessingShape" mc:Ignorable="w14 wp14">
-  <w:docDefaults>
-    <w:rPrDefault>
-      <w:rPr>
-        <w:rFonts w:asciiTheme="minorHAnsi" w:eastAsiaTheme="minorHAnsi" w:hAnsiTheme="minorHAnsi" w:cstheme="minorBidi"/>
-        <w:sz w:val="22"/>
-        <w:szCs w:val="22"/>
-        <w:lang w:val="en-AU" w:eastAsia="en-US" w:bidi="ar-SA"/>
-      </w:rPr>
-    </w:rPrDefault>
-    <w:pPrDefault>
-      <w:pPr>
-        <w:spacing w:after="200" w:line="276" w:lineRule="auto"/>
-      </w:pPr>
-    </w:pPrDefault>
-  </w:docDefaults>
-  <w:latentStyles w:defLockedState="0" w:defUIPriority="99" w:defSemiHidden="1" w:defUnhideWhenUsed="1" w:defQFormat="0" w:count="267">
-    <w:lsdException w:name="Normal" w:semiHidden="0" w:uiPriority="0" w:unhideWhenUsed="0" w:qFormat="1"/>
-    <w:lsdException w:name="heading 1" w:semiHidden="0" w:uiPriority="9" w:unhideWhenUsed="0" w:qFormat="1"/>
-    <w:lsdException w:name="heading 2" w:uiPriority="9" w:qFormat="1"/>
-    <w:lsdException w:name="heading 3" w:uiPriority="9" w:qFormat="1"/>
-    <w:lsdException w:name="heading 4" w:uiPriority="9" w:qFormat="1"/>
-    <w:lsdException w:name="heading 5" w:uiPriority="9" w:qFormat="1"/>
-    <w:lsdException w:name="heading 6" w:uiPriority="9" w:qFormat="1"/>
-    <w:lsdException w:name="heading 7" w:uiPriority="9" w:qFormat="1"/>
-    <w:lsdException w:name="heading 8" w:uiPriority="9" w:qFormat="1"/>
-    <w:lsdException w:name="heading 9" w:uiPriority="9" w:qFormat="1"/>
-    <w:lsdException w:name="toc 1" w:uiPriority="39"/>
-    <w:lsdException w:name="toc 2" w:uiPriority="39"/>
-    <w:lsdException w:name="toc 3" w:uiPriority="39"/>
-    <w:lsdException w:name="toc 4" w:uiPriority="39"/>
-    <w:lsdException w:name="toc 5" w:uiPriority="39"/>
-    <w:lsdException w:name="toc 6" w:uiPriority="39"/>
-    <w:lsdException w:name="toc 7" w:uiPriority="39"/>
-    <w:lsdException w:name="toc 8" w:uiPriority="39"/>
-    <w:lsdException w:name="toc 9" w:uiPriority="39"/>
-    <w:lsdException w:name="caption" w:uiPriority="35" w:qFormat="1"/>
-    <w:lsdException w:name="Title" w:semiHidden="0" w:uiPriority="10" w:unhideWhenUsed="0" w:qFormat="1"/>
-    <w:lsdException w:name="Default Paragraph Font" w:uiPriority="1"/>
-    <w:lsdException w:name="Subtitle" w:semiHidden="0" w:uiPriority="11" w:unhideWhenUsed="0" w:qFormat="1"/>
-    <w:lsdException w:name="Strong" w:semiHidden="0" w:uiPriority="22" w:unhideWhenUsed="0" w:qFormat="1"/>
-    <w:lsdException w:name="Emphasis" w:semiHidden="0" w:uiPriority="20" w:unhideWhenUsed="0" w:qFormat="1"/>
-    <w:lsdException w:name="Table Grid" w:semiHidden="0" w:uiPriority="59" w:unhideWhenUsed="0"/>
-    <w:lsdException w:name="Placeholder Text" w:unhideWhenUsed="0"/>
-    <w:lsdException w:name="No Spacing" w:semiHidden="0" w:uiPriority="1" w:unhideWhenUsed="0" w:qFormat="1"/>
-    <w:lsdException w:name="Light Shading" w:semiHidden="0" w:uiPriority="60" w:unhideWhenUsed="0"/>
-    <w:lsdException w:name="Light List" w:semiHidden="0" w:uiPriority="61" w:unhideWhenUsed="0"/>
-    <w:lsdException w:name="Light Grid" w:semiHidden="0" w:uiPriority="62" w:unhideWhenUsed="0"/>
-    <w:lsdException w:name="Medium Shading 1" w:semiHidden="0" w:uiPriority="63" w:unhideWhenUsed="0"/>
-    <w:lsdException w:name="Medium Shading 2" w:semiHidden="0" w:uiPriority="64" w:unhideWhenUsed="0"/>
-    <w:lsdException w:name="Medium List 1" w:semiHidden="0" w:uiPriority="65" w:unhideWhenUsed="0"/>
-    <w:lsdException w:name="Medium List 2" w:semiHidden="0" w:uiPriority="66" w:unhideWhenUsed="0"/>
-    <w:lsdException w:name="Medium Grid 1" w:semiHidden="0" w:uiPriority="67" w:unhideWhenUsed="0"/>
-    <w:lsdException w:name="Medium Grid 2" w:semiHidden="0" w:uiPriority="68" w:unhideWhenUsed="0"/>
-    <w:lsdException w:name="Medium Grid 3" w:semiHidden="0" w:uiPriority="69" w:unhideWhenUsed="0"/>
-    <w:lsdException w:name="Dark List" w:semiHidden="0" w:uiPriority="70" w:unhideWhenUsed="0"/>
-    <w:lsdException w:name="Colorful Shading" w:semiHidden="0" w:uiPriority="71" w:unhideWhenUsed="0"/>
-    <w:lsdException w:name="Colorful List" w:semiHidden="0" w:uiPriority="72" w:unhideWhenUsed="0"/>
-    <w:lsdException w:name="Colorful Grid" w:semiHidden="0" w:uiPriority="73" w:unhideWhenUsed="0"/>
-    <w:lsdException w:name="Light Shading Accent 1" w:semiHidden="0" w:uiPriority="60" w:unhideWhenUsed="0"/>
-    <w:lsdException w:name="Light List Accent 1" w:semiHidden="0" w:uiPriority="61" w:unhideWhenUsed="0"/>
-    <w:lsdException w:name="Light Grid Accent 1" w:semiHidden="0" w:uiPriority="62" w:unhideWhenUsed="0"/>
-    <w:lsdException w:name="Medium Shading 1 Accent 1" w:semiHidden="0" w:uiPriority="63" w:unhideWhenUsed="0"/>
-    <w:lsdException w:name="Medium Shading 2 Accent 1" w:semiHidden="0" w:uiPriority="64" w:unhideWhenUsed="0"/>
-    <w:lsdException w:name="Medium List 1 Accent 1" w:semiHidden="0" w:uiPriority="65" w:unhideWhenUsed="0"/>
-    <w:lsdException w:name="Revision" w:unhideWhenUsed="0"/>
-    <w:lsdException w:name="List Paragraph" w:semiHidden="0" w:uiPriority="34" w:unhideWhenUsed="0" w:qFormat="1"/>
-    <w:lsdException w:name="Quote" w:semiHidden="0" w:uiPriority="29" w:unhideWhenUsed="0" w:qFormat="1"/>
-    <w:lsdException w:name="Intense Quote" w:semiHidden="0" w:uiPriority="30" w:unhideWhenUsed="0" w:qFormat="1"/>
-    <w:lsdException w:name="Medium List 2 Accent 1" w:semiHidden="0" w:uiPriority="66" w:unhideWhenUsed="0"/>
-    <w:lsdException w:name="Medium Grid 1 Accent 1" w:semiHidden="0" w:uiPriority="67" w:unhideWhenUsed="0"/>
-    <w:lsdException w:name="Medium Grid 2 Accent 1" w:semiHidden="0" w:uiPriority="68" w:unhideWhenUsed="0"/>
-    <w:lsdException w:name="Medium Grid 3 Accent 1" w:semiHidden="0" w:uiPriority="69" w:unhideWhenUsed="0"/>
-    <w:lsdException w:name="Dark List Accent 1" w:semiHidden="0" w:uiPriority="70" w:unhideWhenUsed="0"/>
-    <w:lsdException w:name="Colorful Shading Accent 1" w:semiHidden="0" w:uiPriority="71" w:unhideWhenUsed="0"/>
-    <w:lsdException w:name="Colorful List Accent 1" w:semiHidden="0" w:uiPriority="72" w:unhideWhenUsed="0"/>
-    <w:lsdException w:name="Colorful Grid Accent 1" w:semiHidden="0" w:uiPriority="73" w:unhideWhenUsed="0"/>
-    <w:lsdException w:name="Light Shading Accent 2" w:semiHidden="0" w:uiPriority="60" w:unhideWhenUsed="0"/>
-    <w:lsdException w:name="Light List Accent 2" w:semiHidden="0" w:uiPriority="61" w:unhideWhenUsed="0"/>
-    <w:lsdException w:name="Light Grid Accent 2" w:semiHidden="0" w:uiPriority="62" w:unhideWhenUsed="0"/>
-    <w:lsdException w:name="Medium Shading 1 Accent 2" w:semiHidden="0" w:uiPriority="63" w:unhideWhenUsed="0"/>
-    <w:lsdException w:name="Medium Shading 2 Accent 2" w:semiHidden="0" w:uiPriority="64" w:unhideWhenUsed="0"/>
-    <w:lsdException w:name="Medium List 1 Accent 2" w:semiHidden="0" w:uiPriority="65" w:unhideWhenUsed="0"/>
-    <w:lsdException w:name="Medium List 2 Accent 2" w:semiHidden="0" w:uiPriority="66" w:unhideWhenUsed="0"/>
-    <w:lsdException w:name="Medium Grid 1 Accent 2" w:semiHidden="0" w:uiPriority="67" w:unhideWhenUsed="0"/>
-    <w:lsdException w:name="Medium Grid 2 Accent 2" w:semiHidden="0" w:uiPriority="68" w:unhideWhenUsed="0"/>
-    <w:lsdException w:name="Medium Grid 3 Accent 2" w:semiHidden="0" w:uiPriority="69" w:unhideWhenUsed="0"/>
-    <w:lsdException w:name="Dark List Accent 2" w:semiHidden="0" w:uiPriority="70" w:unhideWhenUsed="0"/>
-    <w:lsdException w:name="Colorful Shading Accent 2" w:semiHidden="0" w:uiPriority="71" w:unhideWhenUsed="0"/>
-    <w:lsdException w:name="Colorful List Accent 2" w:semiHidden="0" w:uiPriority="72" w:unhideWhenUsed="0"/>
-    <w:lsdException w:name="Colorful Grid Accent 2" w:semiHidden="0" w:uiPriority="73" w:unhideWhenUsed="0"/>
-    <w:lsdException w:name="Light Shading Accent 3" w:semiHidden="0" w:uiPriority="60" w:unhideWhenUsed="0"/>
-    <w:lsdException w:name="Light List Accent 3" w:semiHidden="0" w:uiPriority="61" w:unhideWhenUsed="0"/>
-    <w:lsdException w:name="Light Grid Accent 3" w:semiHidden="0" w:uiPriority="62" w:unhideWhenUsed="0"/>
-    <w:lsdException w:name="Medium Shading 1 Accent 3" w:semiHidden="0" w:uiPriority="63" w:unhideWhenUsed="0"/>
-    <w:lsdException w:name="Medium Shading 2 Accent 3" w:semiHidden="0" w:uiPriority="64" w:unhideWhenUsed="0"/>
-    <w:lsdException w:name="Medium List 1 Accent 3" w:semiHidden="0" w:uiPriority="65" w:unhideWhenUsed="0"/>
-    <w:lsdException w:name="Medium List 2 Accent 3" w:semiHidden="0" w:uiPriority="66" w:unhideWhenUsed="0"/>
-    <w:lsdException w:name="Medium Grid 1 Accent 3" w:semiHidden="0" w:uiPriority="67" w:unhideWhenUsed="0"/>
-    <w:lsdException w:name="Medium Grid 2 Accent 3" w:semiHidden="0" w:uiPriority="68" w:unhideWhenUsed="0"/>
-    <w:lsdException w:name="Medium Grid 3 Accent 3" w:semiHidden="0" w:uiPriority="69" w:unhideWhenUsed="0"/>
-    <w:lsdException w:name="Dark List Accent 3" w:semiHidden="0" w:uiPriority="70" w:unhideWhenUsed="0"/>
-    <w:lsdException w:name="Colorful Shading Accent 3" w:semiHidden="0" w:uiPriority="71" w:unhideWhenUsed="0"/>
-    <w:lsdException w:name="Colorful List Accent 3" w:semiHidden="0" w:uiPriority="72" w:unhideWhenUsed="0"/>
-    <w:lsdException w:name="Colorful Grid Accent 3" w:semiHidden="0" w:uiPriority="73" w:unhideWhenUsed="0"/>
-    <w:lsdException w:name="Light Shading Accent 4" w:semiHidden="0" w:uiPriority="60" w:unhideWhenUsed="0"/>
-    <w:lsdException w:name="Light List Accent 4" w:semiHidden="0" w:uiPriority="61" w:unhideWhenUsed="0"/>
-    <w:lsdException w:name="Light Grid Accent 4" w:semiHidden="0" w:uiPriority="62" w:unhideWhenUsed="0"/>
-    <w:lsdException w:name="Medium Shading 1 Accent 4" w:semiHidden="0" w:uiPriority="63" w:unhideWhenUsed="0"/>
-    <w:lsdException w:name="Medium Shading 2 Accent 4" w:semiHidden="0" w:uiPriority="64" w:unhideWhenUsed="0"/>
-    <w:lsdException w:name="Medium List 1 Accent 4" w:semiHidden="0" w:uiPriority="65" w:unhideWhenUsed="0"/>
-    <w:lsdException w:name="Medium List 2 Accent 4" w:semiHidden="0" w:uiPriority="66" w:unhideWhenUsed="0"/>
-    <w:lsdException w:name="Medium Grid 1 Accent 4" w:semiHidden="0" w:uiPriority="67" w:unhideWhenUsed="0"/>
-    <w:lsdException w:name="Medium Grid 2 Accent 4" w:semiHidden="0" w:uiPriority="68" w:unhideWhenUsed="0"/>
-    <w:lsdException w:name="Medium Grid 3 Accent 4" w:semiHidden="0" w:uiPriority="69" w:unhideWhenUsed="0"/>
-    <w:lsdException w:name="Dark List Accent 4" w:semiHidden="0" w:uiPriority="70" w:unhideWhenUsed="0"/>
-    <w:lsdException w:name="Colorful Shading Accent 4" w:semiHidden="0" w:uiPriority="71" w:unhideWhenUsed="0"/>
-    <w:lsdException w:name="Colorful List Accent 4" w:semiHidden="0" w:uiPriority="72" w:unhideWhenUsed="0"/>
-    <w:lsdException w:name="Colorful Grid Accent 4" w:semiHidden="0" w:uiPriority="73" w:unhideWhenUsed="0"/>
-    <w:lsdException w:name="Light Shading Accent 5" w:semiHidden="0" w:uiPriority="60" w:unhideWhenUsed="0"/>
-    <w:lsdException w:name="Light List Accent 5" w:semiHidden="0" w:uiPriority="61" w:unhideWhenUsed="0"/>
-    <w:lsdException w:name="Light Grid Accent 5" w:semiHidden="0" w:uiPriority="62" w:unhideWhenUsed="0"/>
-    <w:lsdException w:name="Medium Shading 1 Accent 5" w:semiHidden="0" w:uiPriority="63" w:unhideWhenUsed="0"/>
-    <w:lsdException w:name="Medium Shading 2 Accent 5" w:semiHidden="0" w:uiPriority="64" w:unhideWhenUsed="0"/>
-    <w:lsdException w:name="Medium List 1 Accent 5" w:semiHidden="0" w:uiPriority="65" w:unhideWhenUsed="0"/>
-    <w:lsdException w:name="Medium List 2 Accent 5" w:semiHidden="0" w:uiPriority="66" w:unhideWhenUsed="0"/>
-    <w:lsdException w:name="Medium Grid 1 Accent 5" w:semiHidden="0" w:uiPriority="67" w:unhideWhenUsed="0"/>
-    <w:lsdException w:name="Medium Grid 2 Accent 5" w:semiHidden="0" w:uiPriority="68" w:unhideWhenUsed="0"/>
-    <w:lsdException w:name="Medium Grid 3 Accent 5" w:semiHidden="0" w:uiPriority="69" w:unhideWhenUsed="0"/>
-    <w:lsdException w:name="Dark List Accent 5" w:semiHidden="0" w:uiPriority="70" w:unhideWhenUsed="0"/>
-    <w:lsdException w:name="Colorful Shading Accent 5" w:semiHidden="0" w:uiPriority="71" w:unhideWhenUsed="0"/>
-    <w:lsdException w:name="Colorful List Accent 5" w:semiHidden="0" w:uiPriority="72" w:unhideWhenUsed="0"/>
-    <w:lsdException w:name="Colorful Grid Accent 5" w:semiHidden="0" w:uiPriority="73" w:unhideWhenUsed="0"/>
-    <w:lsdException w:name="Light Shading Accent 6" w:semiHidden="0" w:uiPriority="60" w:unhideWhenUsed="0"/>
-    <w:lsdException w:name="Light List Accent 6" w:semiHidden="0" w:uiPriority="61" w:unhideWhenUsed="0"/>
-    <w:lsdException w:name="Light Grid Accent 6" w:semiHidden="0" w:uiPriority="62" w:unhideWhenUsed="0"/>
-    <w:lsdException w:name="Medium Shading 1 Accent 6" w:semiHidden="0" w:uiPriority="63" w:unhideWhenUsed="0"/>
-    <w:lsdException w:name="Medium Shading 2 Accent 6" w:semiHidden="0" w:uiPriority="64" w:unhideWhenUsed="0"/>
-    <w:lsdException w:name="Medium List 1 Accent 6" w:semiHidden="0" w:uiPriority="65" w:unhideWhenUsed="0"/>
-    <w:lsdException w:name="Medium List 2 Accent 6" w:semiHidden="0" w:uiPriority="66" w:unhideWhenUsed="0"/>
-    <w:lsdException w:name="Medium Grid 1 Accent 6" w:semiHidden="0" w:uiPriority="67" w:unhideWhenUsed="0"/>
-    <w:lsdException w:name="Medium Grid 2 Accent 6" w:semiHidden="0" w:uiPriority="68" w:unhideWhenUsed="0"/>
-    <w:lsdException w:name="Medium Grid 3 Accent 6" w:semiHidden="0" w:uiPriority="69" w:unhideWhenUsed="0"/>
-    <w:lsdException w:name="Dark List Accent 6" w:semiHidden="0" w:uiPriority="70" w:unhideWhenUsed="0"/>
-    <w:lsdException w:name="Colorful Shading Accent 6" w:semiHidden="0" w:uiPriority="71" w:unhideWhenUsed="0"/>
-    <w:lsdException w:name="Colorful List Accent 6" w:semiHidden="0" w:uiPriority="72" w:unhideWhenUsed="0"/>
-    <w:lsdException w:name="Colorful Grid Accent 6" w:semiHidden="0" w:uiPriority="73" w:unhideWhenUsed="0"/>
-    <w:lsdException w:name="Subtle Emphasis" w:semiHidden="0" w:uiPriority="19" w:unhideWhenUsed="0" w:qFormat="1"/>
-    <w:lsdException w:name="Intense Emphasis" w:semiHidden="0" w:uiPriority="21" w:unhideWhenUsed="0" w:qFormat="1"/>
-    <w:lsdException w:name="Subtle Reference" w:semiHidden="0" w:uiPriority="31" w:unhideWhenUsed="0" w:qFormat="1"/>
-    <w:lsdException w:name="Intense Reference" w:semiHidden="0" w:uiPriority="32" w:unhideWhenUsed="0" w:qFormat="1"/>
-    <w:lsdException w:name="Book Title" w:semiHidden="0" w:uiPriority="33" w:unhideWhenUsed="0" w:qFormat="1"/>
-    <w:lsdException w:name="Bibliography" w:uiPriority="37"/>
-    <w:lsdException w:name="TOC Heading" w:uiPriority="39" w:qFormat="1"/>
+  <w:latentStyles w:defLockedState="0" w:defUIPriority="99" w:defSemiHidden="0" w:defUnhideWhenUsed="0" w:defQFormat="0" w:count="376">
+    <w:lsdException w:name="Normal" w:uiPriority="0" w:qFormat="1"/>
+    <w:lsdException w:name="heading 1" w:uiPriority="9" w:qFormat="1"/>
+    <w:lsdException w:name="heading 2" w:semiHidden="1" w:uiPriority="9" w:unhideWhenUsed="1" w:qFormat="1"/>
+    <w:lsdException w:name="heading 3" w:semiHidden="1" w:uiPriority="9" w:unhideWhenUsed="1" w:qFormat="1"/>
+    <w:lsdException w:name="heading 4" w:semiHidden="1" w:uiPriority="9" w:unhideWhenUsed="1" w:qFormat="1"/>
+    <w:lsdException w:name="heading 5" w:semiHidden="1" w:uiPriority="9" w:unhideWhenUsed="1" w:qFormat="1"/>
+    <w:lsdException w:name="heading 6" w:semiHidden="1" w:uiPriority="9" w:unhideWhenUsed="1" w:qFormat="1"/>
+    <w:lsdException w:name="heading 7" w:semiHidden="1" w:uiPriority="9" w:unhideWhenUsed="1" w:qFormat="1"/>
+    <w:lsdException w:name="heading 8" w:semiHidden="1" w:uiPriority="9" w:unhideWhenUsed="1" w:qFormat="1"/>
+    <w:lsdException w:name="heading 9" w:semiHidden="1" w:uiPriority="9" w:unhideWhenUsed="1" w:qFormat="1"/>
+    <w:lsdException w:name="index 1" w:semiHidden="1" w:unhideWhenUsed="1"/>
+    <w:lsdException w:name="index 2" w:semiHidden="1" w:unhideWhenUsed="1"/>
+    <w:lsdException w:name="index 3" w:semiHidden="1" w:unhideWhenUsed="1"/>
+    <w:lsdException w:name="index 4" w:semiHidden="1" w:unhideWhenUsed="1"/>
+    <w:lsdException w:name="index 5" w:semiHidden="1" w:unhideWhenUsed="1"/>
+    <w:lsdException w:name="index 6" w:semiHidden="1" w:unhideWhenUsed="1"/>
+    <w:lsdException w:name="index 7" w:semiHidden="1" w:unhideWhenUsed="1"/>
+    <w:lsdException w:name="index 8" w:semiHidden="1" w:unhideWhenUsed="1"/>
+    <w:lsdException w:name="index 9" w:semiHidden="1" w:unhideWhenUsed="1"/>
+    <w:lsdException w:name="toc 1" w:semiHidden="1" w:uiPriority="39" w:unhideWhenUsed="1"/>
+    <w:lsdException w:name="toc 2" w:semiHidden="1" w:uiPriority="39" w:unhideWhenUsed="1"/>
+    <w:lsdException w:name="toc 3" w:semiHidden="1" w:uiPriority="39" w:unhideWhenUsed="1"/>
+    <w:lsdException w:name="toc 4" w:semiHidden="1" w:uiPriority="39" w:unhideWhenUsed="1"/>
+    <w:lsdException w:name="toc 5" w:semiHidden="1" w:uiPriority="39" w:unhideWhenUsed="1"/>
+    <w:lsdException w:name="toc 6" w:semiHidden="1" w:uiPriority="39" w:unhideWhenUsed="1"/>
+    <w:lsdException w:name="toc 7" w:semiHidden="1" w:uiPriority="39" w:unhideWhenUsed="1"/>
+    <w:lsdException w:name="toc 8" w:semiHidden="1" w:uiPriority="39" w:unhideWhenUsed="1"/>
+    <w:lsdException w:name="toc 9" w:semiHidden="1" w:uiPriority="39" w:unhideWhenUsed="1"/>
+    <w:lsdException w:name="Normal Indent" w:semiHidden="1" w:unhideWhenUsed="1"/>
+    <w:lsdException w:name="footnote text" w:semiHidden="1" w:unhideWhenUsed="1"/>
+    <w:lsdException w:name="annotation text" w:semiHidden="1" w:unhideWhenUsed="1"/>
+    <w:lsdException w:name="header" w:semiHidden="1" w:unhideWhenUsed="1"/>
+    <w:lsdException w:name="footer" w:semiHidden="1" w:unhideWhenUsed="1"/>
+    <w:lsdException w:name="index heading" w:semiHidden="1" w:unhideWhenUsed="1"/>
+    <w:lsdException w:name="caption" w:semiHidden="1" w:uiPriority="35" w:unhideWhenUsed="1" w:qFormat="1"/>
+    <w:lsdException w:name="table of figures" w:semiHidden="1" w:unhideWhenUsed="1"/>
+    <w:lsdException w:name="envelope address" w:semiHidden="1" w:unhideWhenUsed="1"/>
+    <w:lsdException w:name="envelope return" w:semiHidden="1" w:unhideWhenUsed="1"/>
+    <w:lsdException w:name="footnote reference" w:semiHidden="1" w:unhideWhenUsed="1"/>
+    <w:lsdException w:name="annotation reference" w:semiHidden="1" w:unhideWhenUsed="1"/>
+    <w:lsdException w:name="line number" w:semiHidden="1" w:unhideWhenUsed="1"/>
+    <w:lsdException w:name="page number" w:semiHidden="1" w:unhideWhenUsed="1"/>
+    <w:lsdException w:name="endnote reference" w:semiHidden="1" w:unhideWhenUsed="1"/>
+    <w:lsdException w:name="endnote text" w:semiHidden="1" w:unhideWhenUsed="1"/>
+    <w:lsdException w:name="table of authorities" w:semiHidden="1" w:unhideWhenUsed="1"/>
+    <w:lsdException w:name="macro" w:semiHidden="1" w:unhideWhenUsed="1"/>
+    <w:lsdException w:name="toa heading" w:semiHidden="1" w:unhideWhenUsed="1"/>
+    <w:lsdException w:name="List" w:semiHidden="1" w:unhideWhenUsed="1"/>
+    <w:lsdException w:name="List Bullet" w:semiHidden="1" w:unhideWhenUsed="1"/>
+    <w:lsdException w:name="List Number" w:semiHidden="1" w:unhideWhenUsed="1"/>
+    <w:lsdException w:name="List 2" w:semiHidden="1" w:unhideWhenUsed="1"/>
+    <w:lsdException w:name="List 3" w:semiHidden="1" w:unhideWhenUsed="1"/>
+    <w:lsdException w:name="List 4" w:semiHidden="1" w:unhideWhenUsed="1"/>
+    <w:lsdException w:name="List 5" w:semiHidden="1" w:unhideWhenUsed="1"/>
+    <w:lsdException w:name="List Bullet 2" w:semiHidden="1" w:unhideWhenUsed="1"/>
+    <w:lsdException w:name="List Bullet 3" w:semiHidden="1" w:unhideWhenUsed="1"/>
+    <w:lsdException w:name="List Bullet 4" w:semiHidden="1" w:unhideWhenUsed="1"/>
+    <w:lsdException w:name="List Bullet 5" w:semiHidden="1" w:unhideWhenUsed="1"/>
+    <w:lsdException w:name="List Number 2" w:semiHidden="1" w:unhideWhenUsed="1"/>
+    <w:lsdException w:name="List Number 3" w:semiHidden="1" w:unhideWhenUsed="1"/>
+    <w:lsdException w:name="List Number 4" w:semiHidden="1" w:unhideWhenUsed="1"/>
+    <w:lsdException w:name="List Number 5" w:semiHidden="1" w:unhideWhenUsed="1"/>
+    <w:lsdException w:name="Title" w:uiPriority="10" w:qFormat="1"/>
+    <w:lsdException w:name="Closing" w:semiHidden="1" w:unhideWhenUsed="1"/>
+    <w:lsdException w:name="Signature" w:semiHidden="1" w:unhideWhenUsed="1"/>
+    <w:lsdException w:name="Default Paragraph Font" w:semiHidden="1" w:uiPriority="1" w:unhideWhenUsed="1"/>
+    <w:lsdException w:name="Body Text" w:semiHidden="1" w:unhideWhenUsed="1"/>
+    <w:lsdException w:name="Body Text Indent" w:semiHidden="1" w:unhideWhenUsed="1"/>
+    <w:lsdException w:name="List Continue" w:semiHidden="1" w:unhideWhenUsed="1"/>
+    <w:lsdException w:name="List Continue 2" w:semiHidden="1" w:unhideWhenUsed="1"/>
+    <w:lsdException w:name="List Continue 3" w:semiHidden="1" w:unhideWhenUsed="1"/>
+    <w:lsdException w:name="List Continue 4" w:semiHidden="1" w:unhideWhenUsed="1"/>
+    <w:lsdException w:name="List Continue 5" w:semiHidden="1" w:unhideWhenUsed="1"/>
+    <w:lsdException w:name="Message Header" w:semiHidden="1" w:unhideWhenUsed="1"/>
+    <w:lsdException w:name="Subtitle" w:uiPriority="11" w:qFormat="1"/>
+    <w:lsdException w:name="Salutation" w:semiHidden="1" w:unhideWhenUsed="1"/>
+    <w:lsdException w:name="Date" w:semiHidden="1" w:unhideWhenUsed="1"/>
+    <w:lsdException w:name="Body Text First Indent" w:semiHidden="1" w:unhideWhenUsed="1"/>
+    <w:lsdException w:name="Body Text First Indent 2" w:semiHidden="1" w:unhideWhenUsed="1"/>
+    <w:lsdException w:name="Note Heading" w:semiHidden="1" w:unhideWhenUsed="1"/>
+    <w:lsdException w:name="Body Text 2" w:semiHidden="1" w:unhideWhenUsed="1"/>
+    <w:lsdException w:name="Body Text 3" w:semiHidden="1" w:unhideWhenUsed="1"/>
+    <w:lsdException w:name="Body Text Indent 2" w:semiHidden="1" w:unhideWhenUsed="1"/>
+    <w:lsdException w:name="Body Text Indent 3" w:semiHidden="1" w:unhideWhenUsed="1"/>
+    <w:lsdException w:name="Block Text" w:semiHidden="1" w:unhideWhenUsed="1"/>
+    <w:lsdException w:name="Hyperlink" w:semiHidden="1" w:unhideWhenUsed="1"/>
+    <w:lsdException w:name="FollowedHyperlink" w:semiHidden="1" w:unhideWhenUsed="1"/>
+    <w:lsdException w:name="Strong" w:uiPriority="22" w:qFormat="1"/>
+    <w:lsdException w:name="Emphasis" w:uiPriority="20" w:qFormat="1"/>
+    <w:lsdException w:name="Document Map" w:semiHidden="1" w:unhideWhenUsed="1"/>
+    <w:lsdException w:name="Plain Text" w:semiHidden="1" w:unhideWhenUsed="1"/>
+    <w:lsdException w:name="E-mail Signature" w:semiHidden="1" w:unhideWhenUsed="1"/>
+    <w:lsdException w:name="HTML Top of Form" w:semiHidden="1" w:unhideWhenUsed="1"/>
+    <w:lsdException w:name="HTML Bottom of Form" w:semiHidden="1" w:unhideWhenUsed="1"/>
+    <w:lsdException w:name="Normal (Web)" w:semiHidden="1" w:unhideWhenUsed="1"/>
+    <w:lsdException w:name="HTML Acronym" w:semiHidden="1" w:unhideWhenUsed="1"/>
+    <w:lsdException w:name="HTML Address" w:semiHidden="1" w:unhideWhenUsed="1"/>
+    <w:lsdException w:name="HTML Cite" w:semiHidden="1" w:unhideWhenUsed="1"/>
+    <w:lsdException w:name="HTML Code" w:semiHidden="1" w:unhideWhenUsed="1"/>
+    <w:lsdException w:name="HTML Definition" w:semiHidden="1" w:unhideWhenUsed="1"/>
+    <w:lsdException w:name="HTML Keyboard" w:semiHidden="1" w:unhideWhenUsed="1"/>
+    <w:lsdException w:name="HTML Preformatted" w:semiHidden="1" w:unhideWhenUsed="1"/>
+    <w:lsdException w:name="HTML Sample" w:semiHidden="1" w:unhideWhenUsed="1"/>
+    <w:lsdException w:name="HTML Typewriter" w:semiHidden="1" w:unhideWhenUsed="1"/>
+    <w:lsdException w:name="HTML Variable" w:semiHidden="1" w:unhideWhenUsed="1"/>
+    <w:lsdException w:name="Normal Table" w:semiHidden="1" w:unhideWhenUsed="1"/>
+    <w:lsdException w:name="annotation subject" w:semiHidden="1" w:unhideWhenUsed="1"/>
+    <w:lsdException w:name="No List" w:semiHidden="1" w:unhideWhenUsed="1"/>
+    <w:lsdException w:name="Outline List 1" w:semiHidden="1" w:unhideWhenUsed="1"/>
+    <w:lsdException w:name="Outline List 2" w:semiHidden="1" w:unhideWhenUsed="1"/>
+    <w:lsdException w:name="Outline List 3" w:semiHidden="1" w:unhideWhenUsed="1"/>
+    <w:lsdException w:name="Table Simple 1" w:semiHidden="1" w:unhideWhenUsed="1"/>
+    <w:lsdException w:name="Table Simple 2" w:semiHidden="1" w:unhideWhenUsed="1"/>
+    <w:lsdException w:name="Table Simple 3" w:semiHidden="1" w:unhideWhenUsed="1"/>
+    <w:lsdException w:name="Table Classic 1" w:semiHidden="1" w:unhideWhenUsed="1"/>
+    <w:lsdException w:name="Table Classic 2" w:semiHidden="1" w:unhideWhenUsed="1"/>
+    <w:lsdException w:name="Table Classic 3" w:semiHidden="1" w:unhideWhenUsed="1"/>
+    <w:lsdException w:name="Table Classic 4" w:semiHidden="1" w:unhideWhenUsed="1"/>
+    <w:lsdException w:name="Table Colorful 1" w:semiHidden="1" w:unhideWhenUsed="1"/>
+    <w:lsdException w:name="Table Colorful 2" w:semiHidden="1" w:unhideWhenUsed="1"/>
+    <w:lsdException w:name="Table Colorful 3" w:semiHidden="1" w:unhideWhenUsed="1"/>
+    <w:lsdException w:name="Table Columns 1" w:semiHidden="1" w:unhideWhenUsed="1"/>
+    <w:lsdException w:name="Table Columns 2" w:semiHidden="1" w:unhideWhenUsed="1"/>
+    <w:lsdException w:name="Table Columns 3" w:semiHidden="1" w:unhideWhenUsed="1"/>
+    <w:lsdException w:name="Table Columns 4" w:semiHidden="1" w:unhideWhenUsed="1"/>
+    <w:lsdException w:name="Table Columns 5" w:semiHidden="1" w:unhideWhenUsed="1"/>
+    <w:lsdException w:name="Table Grid 1" w:semiHidden="1" w:unhideWhenUsed="1"/>
+    <w:lsdException w:name="Table Grid 2" w:semiHidden="1" w:unhideWhenUsed="1"/>
+    <w:lsdException w:name="Table Grid 3" w:semiHidden="1" w:unhideWhenUsed="1"/>
+    <w:lsdException w:name="Table Grid 4" w:semiHidden="1" w:unhideWhenUsed="1"/>
+    <w:lsdException w:name="Table Grid 5" w:semiHidden="1" w:unhideWhenUsed="1"/>
+    <w:lsdException w:name="Table Grid 6" w:semiHidden="1" w:unhideWhenUsed="1"/>
+    <w:lsdException w:name="Table Grid 7" w:semiHidden="1" w:unhideWhenUsed="1"/>
+    <w:lsdException w:name="Table Grid 8" w:semiHidden="1" w:unhideWhenUsed="1"/>
+    <w:lsdException w:name="Table List 1" w:semiHidden="1" w:unhideWhenUsed="1"/>
+    <w:lsdException w:name="Table List 2" w:semiHidden="1" w:unhideWhenUsed="1"/>
+    <w:lsdException w:name="Table List 3" w:semiHidden="1" w:unhideWhenUsed="1"/>
+    <w:lsdException w:name="Table List 4" w:semiHidden="1" w:unhideWhenUsed="1"/>
+    <w:lsdException w:name="Table List 5" w:semiHidden="1" w:unhideWhenUsed="1"/>
+    <w:lsdException w:name="Table List 6" w:semiHidden="1" w:unhideWhenUsed="1"/>
+    <w:lsdException w:name="Table List 7" w:semiHidden="1" w:unhideWhenUsed="1"/>
+    <w:lsdException w:name="Table List 8" w:semiHidden="1" w:unhideWhenUsed="1"/>
+    <w:lsdException w:name="Table 3D effects 1" w:semiHidden="1" w:unhideWhenUsed="1"/>
+    <w:lsdException w:name="Table 3D effects 2" w:semiHidden="1" w:unhideWhenUsed="1"/>
+    <w:lsdException w:name="Table 3D effects 3" w:semiHidden="1" w:unhideWhenUsed="1"/>
+    <w:lsdException w:name="Table Contemporary" w:semiHidden="1" w:unhideWhenUsed="1"/>
+    <w:lsdException w:name="Table Elegant" w:semiHidden="1" w:unhideWhenUsed="1"/>
+    <w:lsdException w:name="Table Professional" w:semiHidden="1" w:unhideWhenUsed="1"/>
+    <w:lsdException w:name="Table Subtle 1" w:semiHidden="1" w:unhideWhenUsed="1"/>
+    <w:lsdException w:name="Table Subtle 2" w:semiHidden="1" w:unhideWhenUsed="1"/>
+    <w:lsdException w:name="Table Web 1" w:semiHidden="1" w:unhideWhenUsed="1"/>
+    <w:lsdException w:name="Table Web 2" w:semiHidden="1" w:unhideWhenUsed="1"/>
+    <w:lsdException w:name="Table Web 3" w:semiHidden="1" w:unhideWhenUsed="1"/>
+    <w:lsdException w:name="Balloon Text" w:semiHidden="1" w:unhideWhenUsed="1"/>
+    <w:lsdException w:name="Table Grid" w:uiPriority="59"/>
+    <w:lsdException w:name="Table Theme" w:semiHidden="1" w:unhideWhenUsed="1"/>
+    <w:lsdException w:name="Placeholder Text" w:semiHidden="1"/>
+    <w:lsdException w:name="No Spacing" w:uiPriority="1" w:qFormat="1"/>
+    <w:lsdException w:name="Light Shading" w:uiPriority="60"/>
+    <w:lsdException w:name="Light List" w:uiPriority="61"/>
+    <w:lsdException w:name="Light Grid" w:uiPriority="62"/>
+    <w:lsdException w:name="Medium Shading 1" w:uiPriority="63"/>
+    <w:lsdException w:name="Medium Shading 2" w:uiPriority="64"/>
+    <w:lsdException w:name="Medium List 1" w:uiPriority="65"/>
+    <w:lsdException w:name="Medium List 2" w:uiPriority="66"/>
+    <w:lsdException w:name="Medium Grid 1" w:uiPriority="67"/>
+    <w:lsdException w:name="Medium Grid 2" w:uiPriority="68"/>
+    <w:lsdException w:name="Medium Grid 3" w:uiPriority="69"/>
+    <w:lsdException w:name="Dark List" w:uiPriority="70"/>
+    <w:lsdException w:name="Colorful Shading" w:uiPriority="71"/>
+    <w:lsdException w:name="Colorful List" w:uiPriority="72"/>
+    <w:lsdException w:name="Colorful Grid" w:uiPriority="73"/>
+    <w:lsdException w:name="Light Shading Accent 1" w:uiPriority="60"/>
+    <w:lsdException w:name="Light List Accent 1" w:uiPriority="61"/>
+    <w:lsdException w:name="Light Grid Accent 1" w:uiPriority="62"/>
+    <w:lsdException w:name="Medium Shading 1 Accent 1" w:uiPriority="63"/>
+    <w:lsdException w:name="Medium Shading 2 Accent 1" w:uiPriority="64"/>
+    <w:lsdException w:name="Medium List 1 Accent 1" w:uiPriority="65"/>
+    <w:lsdException w:name="Revision" w:semiHidden="1"/>
+    <w:lsdException w:name="List Paragraph" w:uiPriority="34" w:qFormat="1"/>
+    <w:lsdException w:name="Quote" w:uiPriority="29" w:qFormat="1"/>
+    <w:lsdException w:name="Intense Quote" w:uiPriority="30" w:qFormat="1"/>
+    <w:lsdException w:name="Medium List 2 Accent 1" w:uiPriority="66"/>
+    <w:lsdException w:name="Medium Grid 1 Accent 1" w:uiPriority="67"/>
+    <w:lsdException w:name="Medium Grid 2 Accent 1" w:uiPriority="68"/>
+    <w:lsdException w:name="Medium Grid 3 Accent 1" w:uiPriority="69"/>
+    <w:lsdException w:name="Dark List Accent 1" w:uiPriority="70"/>
+    <w:lsdException w:name="Colorful Shading Accent 1" w:uiPriority="71"/>
+    <w:lsdException w:name="Colorful List Accent 1" w:uiPriority="72"/>
+    <w:lsdException w:name="Colorful Grid Accent 1" w:uiPriority="73"/>
+    <w:lsdException w:name="Light Shading Accent 2" w:uiPriority="60"/>
+    <w:lsdException w:name="Light List Accent 2" w:uiPriority="61"/>
+    <w:lsdException w:name="Light Grid Accent 2" w:uiPriority="62"/>
+    <w:lsdException w:name="Medium Shading 1 Accent 2" w:uiPriority="63"/>
+    <w:lsdException w:name="Medium Shading 2 Accent 2" w:uiPriority="64"/>
+    <w:lsdException w:name="Medium List 1 Accent 2" w:uiPriority="65"/>
+    <w:lsdException w:name="Medium List 2 Accent 2" w:uiPriority="66"/>
+    <w:lsdException w:name="Medium Grid 1 Accent 2" w:uiPriority="67"/>
+    <w:lsdException w:name="Medium Grid 2 Accent 2" w:uiPriority="68"/>
+    <w:lsdException w:name="Medium Grid 3 Accent 2" w:uiPriority="69"/>
+    <w:lsdException w:name="Dark List Accent 2" w:uiPriority="70"/>
+    <w:lsdException w:name="Colorful Shading Accent 2" w:uiPriority="71"/>
+    <w:lsdException w:name="Colorful List Accent 2" w:uiPriority="72"/>
+    <w:lsdException w:name="Colorful Grid Accent 2" w:uiPriority="73"/>
+    <w:lsdException w:name="Light Shading Accent 3" w:uiPriority="60"/>
+    <w:lsdException w:name="Light List Accent 3" w:uiPriority="61"/>
+    <w:lsdException w:name="Light Grid Accent 3" w:uiPriority="62"/>
+    <w:lsdException w:name="Medium Shading 1 Accent 3" w:uiPriority="63"/>
+    <w:lsdException w:name="Medium Shading 2 Accent 3" w:uiPriority="64"/>
+    <w:lsdException w:name="Medium List 1 Accent 3" w:uiPriority="65"/>
+    <w:lsdException w:name="Medium List 2 Accent 3" w:uiPriority="66"/>
+    <w:lsdException w:name="Medium Grid 1 Accent 3" w:uiPriority="67"/>
+    <w:lsdException w:name="Medium Grid 2 Accent 3" w:uiPriority="68"/>
+    <w:lsdException w:name="Medium Grid 3 Accent 3" w:uiPriority="69"/>
+    <w:lsdException w:name="Dark List Accent 3" w:uiPriority="70"/>
+    <w:lsdException w:name="Colorful Shading Accent 3" w:uiPriority="71"/>
+    <w:lsdException w:name="Colorful List Accent 3" w:uiPriority="72"/>
+    <w:lsdException w:name="Colorful Grid Accent 3" w:uiPriority="73"/>
+    <w:lsdException w:name="Light Shading Accent 4" w:uiPriority="60"/>
+    <w:lsdException w:name="Light List Accent 4" w:uiPriority="61"/>
+    <w:lsdException w:name="Light Grid Accent 4" w:uiPriority="62"/>
+    <w:lsdException w:name="Medium Shading 1 Accent 4" w:uiPriority="63"/>
+    <w:lsdException w:name="Medium Shading 2 Accent 4" w:uiPriority="64"/>
+    <w:lsdException w:name="Medium List 1 Accent 4" w:uiPriority="65"/>
+    <w:lsdException w:name="Medium List 2 Accent 4" w:uiPriority="66"/>
+    <w:lsdException w:name="Medium Grid 1 Accent 4" w:uiPriority="67"/>
+    <w:lsdException w:name="Medium Grid 2 Accent 4" w:uiPriority="68"/>
+    <w:lsdException w:name="Medium Grid 3 Accent 4" w:uiPriority="69"/>
+    <w:lsdException w:name="Dark List Accent 4" w:uiPriority="70"/>
+    <w:lsdException w:name="Colorful Shading Accent 4" w:uiPriority="71"/>
+    <w:lsdException w:name="Colorful List Accent 4" w:uiPriority="72"/>
+    <w:lsdException w:name="Colorful Grid Accent 4" w:uiPriority="73"/>
+    <w:lsdException w:name="Light Shading Accent 5" w:uiPriority="60"/>
+    <w:lsdException w:name="Light List Accent 5" w:uiPriority="61"/>
+    <w:lsdException w:name="Light Grid Accent 5" w:uiPriority="62"/>
+    <w:lsdException w:name="Medium Shading 1 Accent 5" w:uiPriority="63"/>
+    <w:lsdException w:name="Medium Shading 2 Accent 5" w:uiPriority="64"/>
+    <w:lsdException w:name="Medium List 1 Accent 5" w:uiPriority="65"/>
+    <w:lsdException w:name="Medium List 2 Accent 5" w:uiPriority="66"/>
+    <w:lsdException w:name="Medium Grid 1 Accent 5" w:uiPriority="67"/>
+    <w:lsdException w:name="Medium Grid 2 Accent 5" w:uiPriority="68"/>
+    <w:lsdException w:name="Medium Grid 3 Accent 5" w:uiPriority="69"/>
+    <w:lsdException w:name="Dark List Accent 5" w:uiPriority="70"/>
+    <w:lsdException w:name="Colorful Shading Accent 5" w:uiPriority="71"/>
+    <w:lsdException w:name="Colorful List Accent 5" w:uiPriority="72"/>
+    <w:lsdException w:name="Colorful Grid Accent 5" w:uiPriority="73"/>
+    <w:lsdException w:name="Light Shading Accent 6" w:uiPriority="60"/>
+    <w:lsdException w:name="Light List Accent 6" w:uiPriority="61"/>
+    <w:lsdException w:name="Light Grid Accent 6" w:uiPriority="62"/>
+    <w:lsdException w:name="Medium Shading 1 Accent 6" w:uiPriority="63"/>
+    <w:lsdException w:name="Medium Shading 2 Accent 6" w:uiPriority="64"/>
+    <w:lsdException w:name="Medium List 1 Accent 6" w:uiPriority="65"/>
+    <w:lsdException w:name="Medium List 2 Accent 6" w:uiPriority="66"/>
+    <w:lsdException w:name="Medium Grid 1 Accent 6" w:uiPriority="67"/>
+    <w:lsdException w:name="Medium Grid 2 Accent 6" w:uiPriority="68"/>
+    <w:lsdException w:name="Medium Grid 3 Accent 6" w:uiPriority="69"/>
+    <w:lsdException w:name="Dark List Accent 6" w:uiPriority="70"/>
+    <w:lsdException w:name="Colorful Shading Accent 6" w:uiPriority="71"/>
+    <w:lsdException w:name="Colorful List Accent 6" w:uiPriority="72"/>
+    <w:lsdException w:name="Colorful Grid Accent 6" w:uiPriority="73"/>
+    <w:lsdException w:name="Subtle Emphasis" w:uiPriority="19" w:qFormat="1"/>
+    <w:lsdException w:name="Intense Emphasis" w:uiPriority="21" w:qFormat="1"/>
+    <w:lsdException w:name="Subtle Reference" w:uiPriority="31" w:qFormat="1"/>
+    <w:lsdException w:name="Intense Reference" w:uiPriority="32" w:qFormat="1"/>
+    <w:lsdException w:name="Book Title" w:uiPriority="33" w:qFormat="1"/>
+    <w:lsdException w:name="Bibliography" w:semiHidden="1" w:uiPriority="37" w:unhideWhenUsed="1"/>
+    <w:lsdException w:name="TOC Heading" w:semiHidden="1" w:uiPriority="39" w:unhideWhenUsed="1" w:qFormat="1"/>
+    <w:lsdException w:name="Plain Table 1" w:uiPriority="41"/>
+    <w:lsdException w:name="Plain Table 2" w:uiPriority="42"/>
+    <w:lsdException w:name="Plain Table 3" w:uiPriority="43"/>
+    <w:lsdException w:name="Plain Table 4" w:uiPriority="44"/>
+    <w:lsdException w:name="Plain Table 5" w:uiPriority="45"/>
+    <w:lsdException w:name="Grid Table Light" w:uiPriority="40"/>
+    <w:lsdException w:name="Grid Table 1 Light" w:uiPriority="46"/>
+    <w:lsdException w:name="Grid Table 2" w:uiPriority="47"/>
+    <w:lsdException w:name="Grid Table 3" w:uiPriority="48"/>
+    <w:lsdException w:name="Grid Table 4" w:uiPriority="49"/>
+    <w:lsdException w:name="Grid Table 5 Dark" w:uiPriority="50"/>
+    <w:lsdException w:name="Grid Table 6 Colorful" w:uiPriority="51"/>
+    <w:lsdException w:name="Grid Table 7 Colorful" w:uiPriority="52"/>
+    <w:lsdException w:name="Grid Table 1 Light Accent 1" w:uiPriority="46"/>
+    <w:lsdException w:name="Grid Table 2 Accent 1" w:uiPriority="47"/>
+    <w:lsdException w:name="Grid Table 3 Accent 1" w:uiPriority="48"/>
+    <w:lsdException w:name="Grid Table 4 Accent 1" w:uiPriority="49"/>
+    <w:lsdException w:name="Grid Table 5 Dark Accent 1" w:uiPriority="50"/>
+    <w:lsdException w:name="Grid Table 6 Colorful Accent 1" w:uiPriority="51"/>
+    <w:lsdException w:name="Grid Table 7 Colorful Accent 1" w:uiPriority="52"/>
+    <w:lsdException w:name="Grid Table 1 Light Accent 2" w:uiPriority="46"/>
+    <w:lsdException w:name="Grid Table 2 Accent 2" w:uiPriority="47"/>
+    <w:lsdException w:name="Grid Table 3 Accent 2" w:uiPriority="48"/>
+    <w:lsdException w:name="Grid Table 4 Accent 2" w:uiPriority="49"/>
+    <w:lsdException w:name="Grid Table 5 Dark Accent 2" w:uiPriority="50"/>
+    <w:lsdException w:name="Grid Table 6 Colorful Accent 2" w:uiPriority="51"/>
+    <w:lsdException w:name="Grid Table 7 Colorful Accent 2" w:uiPriority="52"/>
+    <w:lsdException w:name="Grid Table 1 Light Accent 3" w:uiPriority="46"/>
+    <w:lsdException w:name="Grid Table 2 Accent 3" w:uiPriority="47"/>
+    <w:lsdException w:name="Grid Table 3 Accent 3" w:uiPriority="48"/>
+    <w:lsdException w:name="Grid Table 4 Accent 3" w:uiPriority="49"/>
+    <w:lsdException w:name="Grid Table 5 Dark Accent 3" w:uiPriority="50"/>
+    <w:lsdException w:name="Grid Table 6 Colorful Accent 3" w:uiPriority="51"/>
+    <w:lsdException w:name="Grid Table 7 Colorful Accent 3" w:uiPriority="52"/>
+    <w:lsdException w:name="Grid Table 1 Light Accent 4" w:uiPriority="46"/>
+    <w:lsdException w:name="Grid Table 2 Accent 4" w:uiPriority="47"/>
+    <w:lsdException w:name="Grid Table 3 Accent 4" w:uiPriority="48"/>
+    <w:lsdException w:name="Grid Table 4 Accent 4" w:uiPriority="49"/>
+    <w:lsdException w:name="Grid Table 5 Dark Accent 4" w:uiPriority="50"/>
+    <w:lsdException w:name="Grid Table 6 Colorful Accent 4" w:uiPriority="51"/>
+    <w:lsdException w:name="Grid Table 7 Colorful Accent 4" w:uiPriority="52"/>
+    <w:lsdException w:name="Grid Table 1 Light Accent 5" w:uiPriority="46"/>
+    <w:lsdException w:name="Grid Table 2 Accent 5" w:uiPriority="47"/>
+    <w:lsdException w:name="Grid Table 3 Accent 5" w:uiPriority="48"/>
+    <w:lsdException w:name="Grid Table 4 Accent 5" w:uiPriority="49"/>
+    <w:lsdException w:name="Grid Table 5 Dark Accent 5" w:uiPriority="50"/>
+    <w:lsdException w:name="Grid Table 6 Colorful Accent 5" w:uiPriority="51"/>
+    <w:lsdException w:name="Grid Table 7 Colorful Accent 5" w:uiPriority="52"/>
+    <w:lsdException w:name="Grid Table 1 Light Accent 6" w:uiPriority="46"/>
+    <w:lsdException w:name="Grid Table 2 Accent 6" w:uiPriority="47"/>
+    <w:lsdException w:name="Grid Table 3 Accent 6" w:uiPriority="48"/>
+    <w:lsdException w:name="Grid Table 4 Accent 6" w:uiPriority="49"/>
+    <w:lsdException w:name="Grid Table 5 Dark Accent 6" w:uiPriority="50"/>
+    <w:lsdException w:name="Grid Table 6 Colorful Accent 6" w:uiPriority="51"/>
+    <w:lsdException w:name="Grid Table 7 Colorful Accent 6" w:uiPriority="52"/>
+    <w:lsdException w:name="List Table 1 Light" w:uiPriority="46"/>
+    <w:lsdException w:name="List Table 2" w:uiPriority="47"/>
+    <w:lsdException w:name="List Table 3" w:uiPriority="48"/>
+    <w:lsdException w:name="List Table 4" w:uiPriority="49"/>
+    <w:lsdException w:name="List Table 5 Dark" w:uiPriority="50"/>
+    <w:lsdException w:name="List Table 6 Colorful" w:uiPriority="51"/>
+    <w:lsdException w:name="List Table 7 Colorful" w:uiPriority="52"/>
+    <w:lsdException w:name="List Table 1 Light Accent 1" w:uiPriority="46"/>
+    <w:lsdException w:name="List Table 2 Accent 1" w:uiPriority="47"/>
+    <w:lsdException w:name="List Table 3 Accent 1" w:uiPriority="48"/>
+    <w:lsdException w:name="List Table 4 Accent 1" w:uiPriority="49"/>
+    <w:lsdException w:name="List Table 5 Dark Accent 1" w:uiPriority="50"/>
+    <w:lsdException w:name="List Table 6 Colorful Accent 1" w:uiPriority="51"/>
+    <w:lsdException w:name="List Table 7 Colorful Accent 1" w:uiPriority="52"/>
+    <w:lsdException w:name="List Table 1 Light Accent 2" w:uiPriority="46"/>
+    <w:lsdException w:name="List Table 2 Accent 2" w:uiPriority="47"/>
+    <w:lsdException w:name="List Table 3 Accent 2" w:uiPriority="48"/>
+    <w:lsdException w:name="List Table 4 Accent 2" w:uiPriority="49"/>
+    <w:lsdException w:name="List Table 5 Dark Accent 2" w:uiPriority="50"/>
+    <w:lsdException w:name="List Table 6 Colorful Accent 2" w:uiPriority="51"/>
+    <w:lsdException w:name="List Table 7 Colorful Accent 2" w:uiPriority="52"/>
+    <w:lsdException w:name="List Table 1 Light Accent 3" w:uiPriority="46"/>
+    <w:lsdException w:name="List Table 2 Accent 3" w:uiPriority="47"/>
+    <w:lsdException w:name="List Table 3 Accent 3" w:uiPriority="48"/>
+    <w:lsdException w:name="List Table 4 Accent 3" w:uiPriority="49"/>
+    <w:lsdException w:name="List Table 5 Dark Accent 3" w:uiPriority="50"/>
+    <w:lsdException w:name="List Table 6 Colorful Accent 3" w:uiPriority="51"/>
+    <w:lsdException w:name="List Table 7 Colorful Accent 3" w:uiPriority="52"/>
+    <w:lsdException w:name="List Table 1 Light Accent 4" w:uiPriority="46"/>
+    <w:lsdException w:name="List Table 2 Accent 4" w:uiPriority="47"/>
+    <w:lsdException w:name="List Table 3 Accent 4" w:uiPriority="48"/>
+    <w:lsdException w:name="List Table 4 Accent 4" w:uiPriority="49"/>
+    <w:lsdException w:name="List Table 5 Dark Accent 4" w:uiPriority="50"/>
+    <w:lsdException w:name="List Table 6 Colorful Accent 4" w:uiPriority="51"/>
+    <w:lsdException w:name="List Table 7 Colorful Accent 4" w:uiPriority="52"/>
+    <w:lsdException w:name="List Table 1 Light Accent 5" w:uiPriority="46"/>
+    <w:lsdException w:name="List Table 2 Accent 5" w:uiPriority="47"/>
+    <w:lsdException w:name="List Table 3 Accent 5" w:uiPriority="48"/>
+    <w:lsdException w:name="List Table 4 Accent 5" w:uiPriority="49"/>
+    <w:lsdException w:name="List Table 5 Dark Accent 5" w:uiPriority="50"/>
+    <w:lsdException w:name="List Table 6 Colorful Accent 5" w:uiPriority="51"/>
+    <w:lsdException w:name="List Table 7 Colorful Accent 5" w:uiPriority="52"/>
+    <w:lsdException w:name="List Table 1 Light Accent 6" w:uiPriority="46"/>
+    <w:lsdException w:name="List Table 2 Accent 6" w:uiPriority="47"/>
+    <w:lsdException w:name="List Table 3 Accent 6" w:uiPriority="48"/>
+    <w:lsdException w:name="List Table 4 Accent 6" w:uiPriority="49"/>
+    <w:lsdException w:name="List Table 5 Dark Accent 6" w:uiPriority="50"/>
+    <w:lsdException w:name="List Table 6 Colorful Accent 6" w:uiPriority="51"/>
+    <w:lsdException w:name="List Table 7 Colorful Accent 6" w:uiPriority="52"/>
+    <w:lsdException w:name="Mention" w:semiHidden="1" w:unhideWhenUsed="1"/>
+    <w:lsdException w:name="Smart Hyperlink" w:semiHidden="1" w:unhideWhenUsed="1"/>
+    <w:lsdException w:name="Hashtag" w:semiHidden="1" w:unhideWhenUsed="1"/>
+    <w:lsdException w:name="Unresolved Mention" w:semiHidden="1" w:unhideWhenUsed="1"/>
+    <w:lsdException w:name="Smart Link" w:semiHidden="1" w:unhideWhenUsed="1"/>
   </w:latentStyles>
   <w:style w:type="paragraph" w:default="1" w:styleId="Normal">
     <w:name w:val="Normal"/>

</xml_diff>